<commit_message>
Restructed code with async and cache
</commit_message>
<xml_diff>
--- a/Documentation - UPDATE.docx
+++ b/Documentation - UPDATE.docx
@@ -1,6 +1,6 @@
 
 <file path=word/document.xml><?xml version="1.0" encoding="utf-8"?>
-<w:document xmlns:wpc="http://schemas.microsoft.com/office/word/2010/wordprocessingCanvas" xmlns:cx="http://schemas.microsoft.com/office/drawing/2014/chartex" xmlns:cx1="http://schemas.microsoft.com/office/drawing/2015/9/8/chartex" xmlns:cx2="http://schemas.microsoft.com/office/drawing/2015/10/21/chartex" xmlns:cx3="http://schemas.microsoft.com/office/drawing/2016/5/9/chartex" xmlns:cx4="http://schemas.microsoft.com/office/drawing/2016/5/10/chartex" xmlns:cx5="http://schemas.microsoft.com/office/drawing/2016/5/11/chartex" xmlns:cx6="http://schemas.microsoft.com/office/drawing/2016/5/12/chartex" xmlns:cx7="http://schemas.microsoft.com/office/drawing/2016/5/13/chartex" xmlns:cx8="http://schemas.microsoft.com/office/drawing/2016/5/14/chartex" xmlns:mc="http://schemas.openxmlformats.org/markup-compatibility/2006" xmlns:aink="http://schemas.microsoft.com/office/drawing/2016/ink" xmlns:am3d="http://schemas.microsoft.com/office/drawing/2017/model3d" xmlns:o="urn:schemas-microsoft-com:office:office" xmlns:oel="http://schemas.microsoft.com/office/2019/extlst" xmlns:r="http://schemas.openxmlformats.org/officeDocument/2006/relationships" xmlns:m="http://schemas.openxmlformats.org/officeDocument/2006/math" xmlns:v="urn:schemas-microsoft-com:vml" xmlns:wp14="http://schemas.microsoft.com/office/word/2010/wordprocessingDrawing" xmlns:wp="http://schemas.openxmlformats.org/drawingml/2006/wordprocessingDrawing" xmlns:w10="urn:schemas-microsoft-com:office:word" xmlns:w="http://schemas.openxmlformats.org/wordprocessingml/2006/main" xmlns:w14="http://schemas.microsoft.com/office/word/2010/wordml" xmlns:w15="http://schemas.microsoft.com/office/word/2012/wordml" xmlns:w16cex="http://schemas.microsoft.com/office/word/2018/wordml/cex" xmlns:w16cid="http://schemas.microsoft.com/office/word/2016/wordml/cid" xmlns:w16="http://schemas.microsoft.com/office/word/2018/wordml" xmlns:w16sdtdh="http://schemas.microsoft.com/office/word/2020/wordml/sdtdatahash" xmlns:w16se="http://schemas.microsoft.com/office/word/2015/wordml/symex" xmlns:wpg="http://schemas.microsoft.com/office/word/2010/wordprocessingGroup" xmlns:wpi="http://schemas.microsoft.com/office/word/2010/wordprocessingInk" xmlns:wne="http://schemas.microsoft.com/office/word/2006/wordml" xmlns:wps="http://schemas.microsoft.com/office/word/2010/wordprocessingShape" mc:Ignorable="w14 w15 w16se w16cid w16 w16cex w16sdtdh wp14">
+<w:document xmlns:wpc="http://schemas.microsoft.com/office/word/2010/wordprocessingCanvas" xmlns:cx="http://schemas.microsoft.com/office/drawing/2014/chartex" xmlns:cx1="http://schemas.microsoft.com/office/drawing/2015/9/8/chartex" xmlns:cx2="http://schemas.microsoft.com/office/drawing/2015/10/21/chartex" xmlns:cx3="http://schemas.microsoft.com/office/drawing/2016/5/9/chartex" xmlns:cx4="http://schemas.microsoft.com/office/drawing/2016/5/10/chartex" xmlns:cx5="http://schemas.microsoft.com/office/drawing/2016/5/11/chartex" xmlns:cx6="http://schemas.microsoft.com/office/drawing/2016/5/12/chartex" xmlns:cx7="http://schemas.microsoft.com/office/drawing/2016/5/13/chartex" xmlns:cx8="http://schemas.microsoft.com/office/drawing/2016/5/14/chartex" xmlns:mc="http://schemas.openxmlformats.org/markup-compatibility/2006" xmlns:aink="http://schemas.microsoft.com/office/drawing/2016/ink" xmlns:am3d="http://schemas.microsoft.com/office/drawing/2017/model3d" xmlns:o="urn:schemas-microsoft-com:office:office" xmlns:oel="http://schemas.microsoft.com/office/2019/extlst" xmlns:r="http://schemas.openxmlformats.org/officeDocument/2006/relationships" xmlns:m="http://schemas.openxmlformats.org/officeDocument/2006/math" xmlns:v="urn:schemas-microsoft-com:vml" xmlns:wp14="http://schemas.microsoft.com/office/word/2010/wordprocessingDrawing" xmlns:wp="http://schemas.openxmlformats.org/drawingml/2006/wordprocessingDrawing" xmlns:w10="urn:schemas-microsoft-com:office:word" xmlns:w="http://schemas.openxmlformats.org/wordprocessingml/2006/main" xmlns:w14="http://schemas.microsoft.com/office/word/2010/wordml" xmlns:w15="http://schemas.microsoft.com/office/word/2012/wordml" xmlns:w16cex="http://schemas.microsoft.com/office/word/2018/wordml/cex" xmlns:w16cid="http://schemas.microsoft.com/office/word/2016/wordml/cid" xmlns:w16="http://schemas.microsoft.com/office/word/2018/wordml" xmlns:w16du="http://schemas.microsoft.com/office/word/2023/wordml/word16du" xmlns:w16sdtdh="http://schemas.microsoft.com/office/word/2020/wordml/sdtdatahash" xmlns:w16sdtfl="http://schemas.microsoft.com/office/word/2024/wordml/sdtformatlock" xmlns:w16se="http://schemas.microsoft.com/office/word/2015/wordml/symex" xmlns:wpg="http://schemas.microsoft.com/office/word/2010/wordprocessingGroup" xmlns:wpi="http://schemas.microsoft.com/office/word/2010/wordprocessingInk" xmlns:wne="http://schemas.microsoft.com/office/word/2006/wordml" xmlns:wps="http://schemas.microsoft.com/office/word/2010/wordprocessingShape" mc:Ignorable="w14 w15 w16se w16cid w16 w16cex w16sdtdh w16sdtfl w16du wp14">
   <w:body>
     <w:p>
       <w:pPr>
@@ -1173,6 +1173,7 @@
         <w:t xml:space="preserve">, </w:t>
       </w:r>
       <w:proofErr w:type="spellStart"/>
+      <w:proofErr w:type="gramStart"/>
       <w:r>
         <w:rPr>
           <w:rStyle w:val="HTMLCode"/>
@@ -1184,12 +1185,20 @@
         <w:rPr>
           <w:rStyle w:val="HTMLCode"/>
         </w:rPr>
-        <w:t>()</w:t>
+        <w:t>(</w:t>
+      </w:r>
+      <w:proofErr w:type="gramEnd"/>
+      <w:r>
+        <w:rPr>
+          <w:rStyle w:val="HTMLCode"/>
+        </w:rPr>
+        <w:t>)</w:t>
       </w:r>
       <w:r>
         <w:t xml:space="preserve">, </w:t>
       </w:r>
       <w:proofErr w:type="spellStart"/>
+      <w:proofErr w:type="gramStart"/>
       <w:r>
         <w:rPr>
           <w:rStyle w:val="HTMLCode"/>
@@ -1201,12 +1210,20 @@
         <w:rPr>
           <w:rStyle w:val="HTMLCode"/>
         </w:rPr>
-        <w:t>()</w:t>
+        <w:t>(</w:t>
+      </w:r>
+      <w:proofErr w:type="gramEnd"/>
+      <w:r>
+        <w:rPr>
+          <w:rStyle w:val="HTMLCode"/>
+        </w:rPr>
+        <w:t>)</w:t>
       </w:r>
       <w:r>
         <w:t xml:space="preserve">, and </w:t>
       </w:r>
       <w:proofErr w:type="spellStart"/>
+      <w:proofErr w:type="gramStart"/>
       <w:r>
         <w:rPr>
           <w:rStyle w:val="HTMLCode"/>
@@ -1218,7 +1235,14 @@
         <w:rPr>
           <w:rStyle w:val="HTMLCode"/>
         </w:rPr>
-        <w:t>()</w:t>
+        <w:t>(</w:t>
+      </w:r>
+      <w:proofErr w:type="gramEnd"/>
+      <w:r>
+        <w:rPr>
+          <w:rStyle w:val="HTMLCode"/>
+        </w:rPr>
+        <w:t>)</w:t>
       </w:r>
       <w:r>
         <w:t xml:space="preserve"> are functional and modular.</w:t>
@@ -2192,7 +2216,15 @@
         </w:numPr>
       </w:pPr>
       <w:r>
-        <w:t xml:space="preserve">Fixed login redirect issues by using </w:t>
+        <w:t xml:space="preserve">Fixed login </w:t>
+      </w:r>
+      <w:proofErr w:type="gramStart"/>
+      <w:r>
+        <w:t>redirect</w:t>
+      </w:r>
+      <w:proofErr w:type="gramEnd"/>
+      <w:r>
+        <w:t xml:space="preserve"> issues by using </w:t>
       </w:r>
       <w:proofErr w:type="spellStart"/>
       <w:r>
@@ -3565,8 +3597,16 @@
         <w:rPr>
           <w:rStyle w:val="HTMLCode"/>
         </w:rPr>
-        <w:t>, value }</w:t>
-      </w:r>
+        <w:t xml:space="preserve">, </w:t>
+      </w:r>
+      <w:proofErr w:type="gramStart"/>
+      <w:r>
+        <w:rPr>
+          <w:rStyle w:val="HTMLCode"/>
+        </w:rPr>
+        <w:t>value }</w:t>
+      </w:r>
+      <w:proofErr w:type="gramEnd"/>
       <w:r>
         <w:t xml:space="preserve"> objects from backend.</w:t>
       </w:r>
@@ -5043,8 +5083,16 @@
         <w:rPr>
           <w:rStyle w:val="HTMLCode"/>
         </w:rPr>
-        <w:t>, value }</w:t>
-      </w:r>
+        <w:t xml:space="preserve">, </w:t>
+      </w:r>
+      <w:proofErr w:type="gramStart"/>
+      <w:r>
+        <w:rPr>
+          <w:rStyle w:val="HTMLCode"/>
+        </w:rPr>
+        <w:t>value }</w:t>
+      </w:r>
+      <w:proofErr w:type="gramEnd"/>
       <w:r>
         <w:t xml:space="preserve"> objects.</w:t>
       </w:r>
@@ -5064,6 +5112,7 @@
         <w:t xml:space="preserve"> + </w:t>
       </w:r>
       <w:proofErr w:type="spellStart"/>
+      <w:proofErr w:type="gramStart"/>
       <w:r>
         <w:rPr>
           <w:rStyle w:val="HTMLCode"/>
@@ -5071,6 +5120,7 @@
         <w:t>option.label</w:t>
       </w:r>
       <w:proofErr w:type="spellEnd"/>
+      <w:proofErr w:type="gramEnd"/>
       <w:r>
         <w:t>.</w:t>
       </w:r>
@@ -5787,6 +5837,7 @@
         <w:t xml:space="preserve">("ADMIN"); </w:t>
       </w:r>
       <w:proofErr w:type="spellStart"/>
+      <w:proofErr w:type="gramStart"/>
       <w:r>
         <w:rPr>
           <w:rStyle w:val="HTMLCode"/>
@@ -5794,6 +5845,7 @@
         <w:t>user.setCompanyId</w:t>
       </w:r>
       <w:proofErr w:type="spellEnd"/>
+      <w:proofErr w:type="gramEnd"/>
       <w:r>
         <w:rPr>
           <w:rStyle w:val="HTMLCode"/>
@@ -5801,6 +5853,7 @@
         <w:t>(</w:t>
       </w:r>
       <w:proofErr w:type="spellStart"/>
+      <w:proofErr w:type="gramStart"/>
       <w:r>
         <w:rPr>
           <w:rStyle w:val="HTMLCode"/>
@@ -5817,6 +5870,7 @@
       <w:r>
         <w:t>.</w:t>
       </w:r>
+      <w:proofErr w:type="gramEnd"/>
     </w:p>
     <w:p>
       <w:pPr>
@@ -6009,7 +6063,21 @@
         <w:rPr>
           <w:rStyle w:val="HTMLCode"/>
         </w:rPr>
-        <w:t>().getName()</w:t>
+        <w:t>(</w:t>
+      </w:r>
+      <w:proofErr w:type="gramStart"/>
+      <w:r>
+        <w:rPr>
+          <w:rStyle w:val="HTMLCode"/>
+        </w:rPr>
+        <w:t>).getName</w:t>
+      </w:r>
+      <w:proofErr w:type="gramEnd"/>
+      <w:r>
+        <w:rPr>
+          <w:rStyle w:val="HTMLCode"/>
+        </w:rPr>
+        <w:t>()</w:t>
       </w:r>
       <w:r>
         <w:t>.</w:t>
@@ -6120,7 +6188,6 @@
         </w:rPr>
         <w:t xml:space="preserve">        </w:t>
       </w:r>
-      <w:proofErr w:type="spellStart"/>
       <w:r>
         <w:rPr>
           <w:b/>
@@ -6128,9 +6195,10 @@
           <w:color w:val="2F5496" w:themeColor="accent1" w:themeShade="BF"/>
           <w:lang w:val="en-US"/>
         </w:rPr>
-        <w:t>Api</w:t>
-      </w:r>
-      <w:proofErr w:type="spellEnd"/>
+        <w:t xml:space="preserve">Api to use the backend </w:t>
+      </w:r>
+      <w:proofErr w:type="spellStart"/>
+      <w:proofErr w:type="gramStart"/>
       <w:r>
         <w:rPr>
           <w:b/>
@@ -6138,10 +6206,9 @@
           <w:color w:val="2F5496" w:themeColor="accent1" w:themeShade="BF"/>
           <w:lang w:val="en-US"/>
         </w:rPr>
-        <w:t xml:space="preserve"> to use the backend </w:t>
-      </w:r>
-      <w:proofErr w:type="spellStart"/>
-      <w:proofErr w:type="gramStart"/>
+        <w:t>api</w:t>
+      </w:r>
+      <w:proofErr w:type="spellEnd"/>
       <w:r>
         <w:rPr>
           <w:b/>
@@ -6149,9 +6216,86 @@
           <w:color w:val="2F5496" w:themeColor="accent1" w:themeShade="BF"/>
           <w:lang w:val="en-US"/>
         </w:rPr>
+        <w:t xml:space="preserve">  calls</w:t>
+      </w:r>
+      <w:proofErr w:type="gramEnd"/>
+    </w:p>
+    <w:p>
+      <w:pPr>
+        <w:rPr>
+          <w:b/>
+          <w:bCs/>
+          <w:color w:val="000000" w:themeColor="text1"/>
+          <w:lang w:val="en-US"/>
+        </w:rPr>
+      </w:pPr>
+      <w:r>
+        <w:rPr>
+          <w:b/>
+          <w:bCs/>
+          <w:color w:val="000000" w:themeColor="text1"/>
+          <w:lang w:val="en-US"/>
+        </w:rPr>
+        <w:t xml:space="preserve">                      /</w:t>
+      </w:r>
+      <w:proofErr w:type="spellStart"/>
+      <w:r>
+        <w:rPr>
+          <w:b/>
+          <w:bCs/>
+          <w:color w:val="000000" w:themeColor="text1"/>
+          <w:lang w:val="en-US"/>
+        </w:rPr>
         <w:t>api</w:t>
       </w:r>
       <w:proofErr w:type="spellEnd"/>
+      <w:r>
+        <w:rPr>
+          <w:b/>
+          <w:bCs/>
+          <w:color w:val="000000" w:themeColor="text1"/>
+          <w:lang w:val="en-US"/>
+        </w:rPr>
+        <w:t>/</w:t>
+      </w:r>
+    </w:p>
+    <w:p>
+      <w:pPr>
+        <w:rPr>
+          <w:b/>
+          <w:bCs/>
+          <w:color w:val="000000" w:themeColor="text1"/>
+          <w:lang w:val="en-US"/>
+        </w:rPr>
+      </w:pPr>
+      <w:r>
+        <w:rPr>
+          <w:b/>
+          <w:bCs/>
+          <w:color w:val="000000" w:themeColor="text1"/>
+          <w:lang w:val="en-US"/>
+        </w:rPr>
+        <w:t xml:space="preserve">                             /login/route.js</w:t>
+      </w:r>
+    </w:p>
+    <w:p>
+      <w:pPr>
+        <w:rPr>
+          <w:b/>
+          <w:bCs/>
+          <w:color w:val="000000" w:themeColor="text1"/>
+          <w:lang w:val="en-US"/>
+        </w:rPr>
+      </w:pPr>
+      <w:r>
+        <w:rPr>
+          <w:b/>
+          <w:bCs/>
+          <w:color w:val="000000" w:themeColor="text1"/>
+          <w:lang w:val="en-US"/>
+        </w:rPr>
+        <w:t xml:space="preserve">                     </w:t>
+      </w:r>
       <w:r>
         <w:rPr>
           <w:b/>
@@ -6159,12 +6303,15 @@
           <w:color w:val="2F5496" w:themeColor="accent1" w:themeShade="BF"/>
           <w:lang w:val="en-US"/>
         </w:rPr>
-        <w:t xml:space="preserve">  calls</w:t>
-      </w:r>
-      <w:proofErr w:type="gramEnd"/>
-    </w:p>
-    <w:p>
-      <w:pPr>
+        <w:t>Components to be added here</w:t>
+      </w:r>
+    </w:p>
+    <w:p>
+      <w:pPr>
+        <w:pStyle w:val="Heading2"/>
+        <w:keepNext w:val="0"/>
+        <w:keepLines w:val="0"/>
+        <w:ind w:left="390" w:hangingChars="150" w:hanging="390"/>
         <w:rPr>
           <w:b/>
           <w:bCs/>
@@ -6179,19 +6326,18 @@
           <w:color w:val="000000" w:themeColor="text1"/>
           <w:lang w:val="en-US"/>
         </w:rPr>
-        <w:t xml:space="preserve">                      /</w:t>
-      </w:r>
-      <w:proofErr w:type="spellStart"/>
-      <w:r>
+        <w:t xml:space="preserve">                   /components/</w:t>
+      </w:r>
+    </w:p>
+    <w:p>
+      <w:pPr>
         <w:rPr>
           <w:b/>
           <w:bCs/>
           <w:color w:val="000000" w:themeColor="text1"/>
           <w:lang w:val="en-US"/>
         </w:rPr>
-        <w:t>api</w:t>
-      </w:r>
-      <w:proofErr w:type="spellEnd"/>
+      </w:pPr>
       <w:r>
         <w:rPr>
           <w:b/>
@@ -6199,17 +6345,28 @@
           <w:color w:val="000000" w:themeColor="text1"/>
           <w:lang w:val="en-US"/>
         </w:rPr>
-        <w:t>/</w:t>
-      </w:r>
-    </w:p>
-    <w:p>
-      <w:pPr>
+        <w:t xml:space="preserve">                                                 /</w:t>
+      </w:r>
+      <w:proofErr w:type="spellStart"/>
+      <w:r>
         <w:rPr>
           <w:b/>
           <w:bCs/>
           <w:color w:val="000000" w:themeColor="text1"/>
           <w:lang w:val="en-US"/>
         </w:rPr>
+        <w:t>header.jsx</w:t>
+      </w:r>
+      <w:proofErr w:type="spellEnd"/>
+    </w:p>
+    <w:p>
+      <w:pPr>
+        <w:rPr>
+          <w:b/>
+          <w:bCs/>
+          <w:color w:val="2F5496" w:themeColor="accent1" w:themeShade="BF"/>
+          <w:lang w:val="en-US"/>
+        </w:rPr>
       </w:pPr>
       <w:r>
         <w:rPr>
@@ -6218,11 +6375,24 @@
           <w:color w:val="000000" w:themeColor="text1"/>
           <w:lang w:val="en-US"/>
         </w:rPr>
-        <w:t xml:space="preserve">                             /login/route.js</w:t>
-      </w:r>
-    </w:p>
-    <w:p>
-      <w:pPr>
+        <w:t xml:space="preserve">               </w:t>
+      </w:r>
+      <w:r>
+        <w:rPr>
+          <w:b/>
+          <w:bCs/>
+          <w:color w:val="2F5496" w:themeColor="accent1" w:themeShade="BF"/>
+          <w:lang w:val="en-US"/>
+        </w:rPr>
+        <w:t xml:space="preserve">     Pages need to be in this format</w:t>
+      </w:r>
+    </w:p>
+    <w:p>
+      <w:pPr>
+        <w:pStyle w:val="Heading2"/>
+        <w:keepNext w:val="0"/>
+        <w:keepLines w:val="0"/>
+        <w:ind w:left="390" w:hangingChars="150" w:hanging="390"/>
         <w:rPr>
           <w:b/>
           <w:bCs/>
@@ -6237,7 +6407,48 @@
           <w:color w:val="000000" w:themeColor="text1"/>
           <w:lang w:val="en-US"/>
         </w:rPr>
-        <w:t xml:space="preserve">                     </w:t>
+        <w:t xml:space="preserve">                  /home/</w:t>
+      </w:r>
+      <w:proofErr w:type="spellStart"/>
+      <w:r>
+        <w:rPr>
+          <w:b/>
+          <w:bCs/>
+          <w:color w:val="000000" w:themeColor="text1"/>
+          <w:lang w:val="en-US"/>
+        </w:rPr>
+        <w:t>page.jsx</w:t>
+      </w:r>
+      <w:proofErr w:type="spellEnd"/>
+    </w:p>
+    <w:p>
+      <w:pPr>
+        <w:rPr>
+          <w:b/>
+          <w:bCs/>
+          <w:color w:val="000000" w:themeColor="text1"/>
+          <w:lang w:val="en-US"/>
+        </w:rPr>
+      </w:pPr>
+    </w:p>
+    <w:p>
+      <w:pPr>
+        <w:ind w:left="994" w:hangingChars="450" w:hanging="994"/>
+        <w:rPr>
+          <w:b/>
+          <w:bCs/>
+          <w:color w:val="000000" w:themeColor="text1"/>
+          <w:lang w:val="en-US"/>
+        </w:rPr>
+      </w:pPr>
+      <w:r>
+        <w:rPr>
+          <w:b/>
+          <w:bCs/>
+          <w:color w:val="000000" w:themeColor="text1"/>
+          <w:lang w:val="en-US"/>
+        </w:rPr>
+        <w:t xml:space="preserve">                   </w:t>
       </w:r>
       <w:r>
         <w:rPr>
@@ -6246,8 +6457,100 @@
           <w:color w:val="2F5496" w:themeColor="accent1" w:themeShade="BF"/>
           <w:lang w:val="en-US"/>
         </w:rPr>
-        <w:t>Components to be added here</w:t>
-      </w:r>
+        <w:t xml:space="preserve"> Styles need to be </w:t>
+      </w:r>
+      <w:proofErr w:type="spellStart"/>
+      <w:r>
+        <w:rPr>
+          <w:b/>
+          <w:bCs/>
+          <w:color w:val="2F5496" w:themeColor="accent1" w:themeShade="BF"/>
+          <w:lang w:val="en-US"/>
+        </w:rPr>
+        <w:t>aded</w:t>
+      </w:r>
+      <w:proofErr w:type="spellEnd"/>
+      <w:r>
+        <w:rPr>
+          <w:b/>
+          <w:bCs/>
+          <w:color w:val="2F5496" w:themeColor="accent1" w:themeShade="BF"/>
+          <w:lang w:val="en-US"/>
+        </w:rPr>
+        <w:t xml:space="preserve"> here, we are using the </w:t>
+      </w:r>
+      <w:proofErr w:type="spellStart"/>
+      <w:r>
+        <w:rPr>
+          <w:b/>
+          <w:bCs/>
+          <w:color w:val="2F5496" w:themeColor="accent1" w:themeShade="BF"/>
+          <w:lang w:val="en-US"/>
+        </w:rPr>
+        <w:t>scss</w:t>
+      </w:r>
+      <w:proofErr w:type="spellEnd"/>
+      <w:r>
+        <w:rPr>
+          <w:b/>
+          <w:bCs/>
+          <w:color w:val="2F5496" w:themeColor="accent1" w:themeShade="BF"/>
+          <w:lang w:val="en-US"/>
+        </w:rPr>
+        <w:t>, also use this module format</w:t>
+      </w:r>
+      <w:r>
+        <w:rPr>
+          <w:b/>
+          <w:bCs/>
+          <w:color w:val="000000" w:themeColor="text1"/>
+          <w:lang w:val="en-US"/>
+        </w:rPr>
+        <w:br/>
+        <w:t>/styles/</w:t>
+      </w:r>
+    </w:p>
+    <w:p>
+      <w:pPr>
+        <w:ind w:left="994" w:hangingChars="450" w:hanging="994"/>
+        <w:rPr>
+          <w:b/>
+          <w:bCs/>
+          <w:color w:val="000000" w:themeColor="text1"/>
+          <w:lang w:val="en-US"/>
+        </w:rPr>
+      </w:pPr>
+      <w:r>
+        <w:rPr>
+          <w:b/>
+          <w:bCs/>
+          <w:color w:val="000000" w:themeColor="text1"/>
+          <w:lang w:val="en-US"/>
+        </w:rPr>
+        <w:t xml:space="preserve">                          /</w:t>
+      </w:r>
+      <w:proofErr w:type="spellStart"/>
+      <w:proofErr w:type="gramStart"/>
+      <w:r>
+        <w:rPr>
+          <w:b/>
+          <w:bCs/>
+          <w:color w:val="000000" w:themeColor="text1"/>
+          <w:lang w:val="en-US"/>
+        </w:rPr>
+        <w:t>header.module</w:t>
+      </w:r>
+      <w:proofErr w:type="gramEnd"/>
+      <w:r>
+        <w:rPr>
+          <w:b/>
+          <w:bCs/>
+          <w:color w:val="000000" w:themeColor="text1"/>
+          <w:lang w:val="en-US"/>
+        </w:rPr>
+        <w:t>.scss</w:t>
+      </w:r>
+      <w:proofErr w:type="spellEnd"/>
     </w:p>
     <w:p>
       <w:pPr>
@@ -6255,252 +6558,6 @@
         <w:keepNext w:val="0"/>
         <w:keepLines w:val="0"/>
         <w:ind w:left="390" w:hangingChars="150" w:hanging="390"/>
-        <w:rPr>
-          <w:b/>
-          <w:bCs/>
-          <w:color w:val="000000" w:themeColor="text1"/>
-          <w:lang w:val="en-US"/>
-        </w:rPr>
-      </w:pPr>
-      <w:r>
-        <w:rPr>
-          <w:b/>
-          <w:bCs/>
-          <w:color w:val="000000" w:themeColor="text1"/>
-          <w:lang w:val="en-US"/>
-        </w:rPr>
-        <w:t xml:space="preserve">                   /components/</w:t>
-      </w:r>
-    </w:p>
-    <w:p>
-      <w:pPr>
-        <w:rPr>
-          <w:b/>
-          <w:bCs/>
-          <w:color w:val="000000" w:themeColor="text1"/>
-          <w:lang w:val="en-US"/>
-        </w:rPr>
-      </w:pPr>
-      <w:r>
-        <w:rPr>
-          <w:b/>
-          <w:bCs/>
-          <w:color w:val="000000" w:themeColor="text1"/>
-          <w:lang w:val="en-US"/>
-        </w:rPr>
-        <w:t xml:space="preserve">                                                 /</w:t>
-      </w:r>
-      <w:proofErr w:type="spellStart"/>
-      <w:r>
-        <w:rPr>
-          <w:b/>
-          <w:bCs/>
-          <w:color w:val="000000" w:themeColor="text1"/>
-          <w:lang w:val="en-US"/>
-        </w:rPr>
-        <w:t>header.jsx</w:t>
-      </w:r>
-      <w:proofErr w:type="spellEnd"/>
-    </w:p>
-    <w:p>
-      <w:pPr>
-        <w:rPr>
-          <w:b/>
-          <w:bCs/>
-          <w:color w:val="2F5496" w:themeColor="accent1" w:themeShade="BF"/>
-          <w:lang w:val="en-US"/>
-        </w:rPr>
-      </w:pPr>
-      <w:r>
-        <w:rPr>
-          <w:b/>
-          <w:bCs/>
-          <w:color w:val="000000" w:themeColor="text1"/>
-          <w:lang w:val="en-US"/>
-        </w:rPr>
-        <w:t xml:space="preserve">               </w:t>
-      </w:r>
-      <w:r>
-        <w:rPr>
-          <w:b/>
-          <w:bCs/>
-          <w:color w:val="2F5496" w:themeColor="accent1" w:themeShade="BF"/>
-          <w:lang w:val="en-US"/>
-        </w:rPr>
-        <w:t xml:space="preserve">     Pages need to be in this format</w:t>
-      </w:r>
-    </w:p>
-    <w:p>
-      <w:pPr>
-        <w:pStyle w:val="Heading2"/>
-        <w:keepNext w:val="0"/>
-        <w:keepLines w:val="0"/>
-        <w:ind w:left="390" w:hangingChars="150" w:hanging="390"/>
-        <w:rPr>
-          <w:b/>
-          <w:bCs/>
-          <w:color w:val="000000" w:themeColor="text1"/>
-          <w:lang w:val="en-US"/>
-        </w:rPr>
-      </w:pPr>
-      <w:r>
-        <w:rPr>
-          <w:b/>
-          <w:bCs/>
-          <w:color w:val="000000" w:themeColor="text1"/>
-          <w:lang w:val="en-US"/>
-        </w:rPr>
-        <w:t xml:space="preserve">                  /home/</w:t>
-      </w:r>
-      <w:proofErr w:type="spellStart"/>
-      <w:r>
-        <w:rPr>
-          <w:b/>
-          <w:bCs/>
-          <w:color w:val="000000" w:themeColor="text1"/>
-          <w:lang w:val="en-US"/>
-        </w:rPr>
-        <w:t>page.jsx</w:t>
-      </w:r>
-      <w:proofErr w:type="spellEnd"/>
-    </w:p>
-    <w:p>
-      <w:pPr>
-        <w:rPr>
-          <w:b/>
-          <w:bCs/>
-          <w:color w:val="000000" w:themeColor="text1"/>
-          <w:lang w:val="en-US"/>
-        </w:rPr>
-      </w:pPr>
-    </w:p>
-    <w:p>
-      <w:pPr>
-        <w:ind w:left="994" w:hangingChars="450" w:hanging="994"/>
-        <w:rPr>
-          <w:b/>
-          <w:bCs/>
-          <w:color w:val="000000" w:themeColor="text1"/>
-          <w:lang w:val="en-US"/>
-        </w:rPr>
-      </w:pPr>
-      <w:r>
-        <w:rPr>
-          <w:b/>
-          <w:bCs/>
-          <w:color w:val="000000" w:themeColor="text1"/>
-          <w:lang w:val="en-US"/>
-        </w:rPr>
-        <w:t xml:space="preserve">                   </w:t>
-      </w:r>
-      <w:r>
-        <w:rPr>
-          <w:b/>
-          <w:bCs/>
-          <w:color w:val="2F5496" w:themeColor="accent1" w:themeShade="BF"/>
-          <w:lang w:val="en-US"/>
-        </w:rPr>
-        <w:t xml:space="preserve"> Styles need to be </w:t>
-      </w:r>
-      <w:proofErr w:type="spellStart"/>
-      <w:r>
-        <w:rPr>
-          <w:b/>
-          <w:bCs/>
-          <w:color w:val="2F5496" w:themeColor="accent1" w:themeShade="BF"/>
-          <w:lang w:val="en-US"/>
-        </w:rPr>
-        <w:t>aded</w:t>
-      </w:r>
-      <w:proofErr w:type="spellEnd"/>
-      <w:r>
-        <w:rPr>
-          <w:b/>
-          <w:bCs/>
-          <w:color w:val="2F5496" w:themeColor="accent1" w:themeShade="BF"/>
-          <w:lang w:val="en-US"/>
-        </w:rPr>
-        <w:t xml:space="preserve"> here, we are using the </w:t>
-      </w:r>
-      <w:proofErr w:type="spellStart"/>
-      <w:r>
-        <w:rPr>
-          <w:b/>
-          <w:bCs/>
-          <w:color w:val="2F5496" w:themeColor="accent1" w:themeShade="BF"/>
-          <w:lang w:val="en-US"/>
-        </w:rPr>
-        <w:t>scss</w:t>
-      </w:r>
-      <w:proofErr w:type="spellEnd"/>
-      <w:r>
-        <w:rPr>
-          <w:b/>
-          <w:bCs/>
-          <w:color w:val="2F5496" w:themeColor="accent1" w:themeShade="BF"/>
-          <w:lang w:val="en-US"/>
-        </w:rPr>
-        <w:t>, also use this module format</w:t>
-      </w:r>
-      <w:r>
-        <w:rPr>
-          <w:b/>
-          <w:bCs/>
-          <w:color w:val="000000" w:themeColor="text1"/>
-          <w:lang w:val="en-US"/>
-        </w:rPr>
-        <w:br/>
-        <w:t>/styles/</w:t>
-      </w:r>
-    </w:p>
-    <w:p>
-      <w:pPr>
-        <w:ind w:left="994" w:hangingChars="450" w:hanging="994"/>
-        <w:rPr>
-          <w:b/>
-          <w:bCs/>
-          <w:color w:val="000000" w:themeColor="text1"/>
-          <w:lang w:val="en-US"/>
-        </w:rPr>
-      </w:pPr>
-      <w:r>
-        <w:rPr>
-          <w:b/>
-          <w:bCs/>
-          <w:color w:val="000000" w:themeColor="text1"/>
-          <w:lang w:val="en-US"/>
-        </w:rPr>
-        <w:t xml:space="preserve">                          /</w:t>
-      </w:r>
-      <w:proofErr w:type="spellStart"/>
-      <w:proofErr w:type="gramStart"/>
-      <w:r>
-        <w:rPr>
-          <w:b/>
-          <w:bCs/>
-          <w:color w:val="000000" w:themeColor="text1"/>
-          <w:lang w:val="en-US"/>
-        </w:rPr>
-        <w:t>header.module</w:t>
-      </w:r>
-      <w:proofErr w:type="gramEnd"/>
-      <w:r>
-        <w:rPr>
-          <w:b/>
-          <w:bCs/>
-          <w:color w:val="000000" w:themeColor="text1"/>
-          <w:lang w:val="en-US"/>
-        </w:rPr>
-        <w:t>.scss</w:t>
-      </w:r>
-      <w:proofErr w:type="spellEnd"/>
-    </w:p>
-    <w:p>
-      <w:pPr>
-        <w:pStyle w:val="Heading2"/>
-        <w:keepNext w:val="0"/>
-        <w:keepLines w:val="0"/>
-        <w:ind w:left="390" w:hangingChars="150" w:hanging="390"/>
       </w:pPr>
       <w:r>
         <w:rPr>
@@ -7469,8 +7526,16 @@
         <w:rPr>
           <w:rStyle w:val="HTMLCode"/>
         </w:rPr>
-        <w:t>, value }</w:t>
-      </w:r>
+        <w:t xml:space="preserve">, </w:t>
+      </w:r>
+      <w:proofErr w:type="gramStart"/>
+      <w:r>
+        <w:rPr>
+          <w:rStyle w:val="HTMLCode"/>
+        </w:rPr>
+        <w:t>value }</w:t>
+      </w:r>
+      <w:proofErr w:type="gramEnd"/>
       <w:r>
         <w:t xml:space="preserve"> pairs for dropdown rendering.</w:t>
       </w:r>
@@ -7983,8 +8048,16 @@
         <w:rPr>
           <w:rStyle w:val="HTMLCode"/>
         </w:rPr>
-        <w:t>, value }</w:t>
-      </w:r>
+        <w:t xml:space="preserve">, </w:t>
+      </w:r>
+      <w:proofErr w:type="gramStart"/>
+      <w:r>
+        <w:rPr>
+          <w:rStyle w:val="HTMLCode"/>
+        </w:rPr>
+        <w:t>value }</w:t>
+      </w:r>
+      <w:proofErr w:type="gramEnd"/>
       <w:r>
         <w:t xml:space="preserve"> objects. Next.js maps them into </w:t>
       </w:r>
@@ -8299,7 +8372,6 @@
         <w:tc>
           <w:tcPr>
             <w:tcW w:w="0" w:type="auto"/>
-            <w:shd w:val="clear" w:color="auto" w:fill="auto"/>
             <w:vAlign w:val="center"/>
           </w:tcPr>
           <w:p>
@@ -8326,7 +8398,6 @@
         <w:tc>
           <w:tcPr>
             <w:tcW w:w="0" w:type="auto"/>
-            <w:shd w:val="clear" w:color="auto" w:fill="auto"/>
             <w:vAlign w:val="center"/>
           </w:tcPr>
           <w:p>
@@ -8353,7 +8424,6 @@
         <w:tc>
           <w:tcPr>
             <w:tcW w:w="0" w:type="auto"/>
-            <w:shd w:val="clear" w:color="auto" w:fill="auto"/>
             <w:vAlign w:val="center"/>
           </w:tcPr>
           <w:p>
@@ -8385,7 +8455,6 @@
         <w:tc>
           <w:tcPr>
             <w:tcW w:w="0" w:type="auto"/>
-            <w:shd w:val="clear" w:color="auto" w:fill="auto"/>
             <w:vAlign w:val="center"/>
           </w:tcPr>
           <w:p>
@@ -8413,7 +8482,6 @@
         <w:tc>
           <w:tcPr>
             <w:tcW w:w="0" w:type="auto"/>
-            <w:shd w:val="clear" w:color="auto" w:fill="auto"/>
             <w:vAlign w:val="center"/>
           </w:tcPr>
           <w:p>
@@ -8431,7 +8499,6 @@
         <w:tc>
           <w:tcPr>
             <w:tcW w:w="0" w:type="auto"/>
-            <w:shd w:val="clear" w:color="auto" w:fill="auto"/>
             <w:vAlign w:val="center"/>
           </w:tcPr>
           <w:p>
@@ -8475,6 +8542,7 @@
               </w:rPr>
               <w:t xml:space="preserve"> + </w:t>
             </w:r>
+            <w:proofErr w:type="gramStart"/>
             <w:r>
               <w:rPr>
                 <w:rStyle w:val="HTMLCode"/>
@@ -8483,7 +8551,18 @@
                 <w:szCs w:val="24"/>
                 <w:lang w:val="en-US" w:eastAsia="zh-CN" w:bidi="ar"/>
               </w:rPr>
-              <w:t>redirect()</w:t>
+              <w:t>redirect(</w:t>
+            </w:r>
+            <w:proofErr w:type="gramEnd"/>
+            <w:r>
+              <w:rPr>
+                <w:rStyle w:val="HTMLCode"/>
+                <w:rFonts w:ascii="SimSun" w:eastAsia="SimSun" w:hAnsi="SimSun" w:cs="SimSun"/>
+                <w:sz w:val="24"/>
+                <w:szCs w:val="24"/>
+                <w:lang w:val="en-US" w:eastAsia="zh-CN" w:bidi="ar"/>
+              </w:rPr>
+              <w:t>)</w:t>
             </w:r>
           </w:p>
         </w:tc>
@@ -8495,7 +8574,6 @@
         <w:tc>
           <w:tcPr>
             <w:tcW w:w="0" w:type="auto"/>
-            <w:shd w:val="clear" w:color="auto" w:fill="auto"/>
             <w:vAlign w:val="center"/>
           </w:tcPr>
           <w:p>
@@ -8514,7 +8592,6 @@
         <w:tc>
           <w:tcPr>
             <w:tcW w:w="0" w:type="auto"/>
-            <w:shd w:val="clear" w:color="auto" w:fill="auto"/>
             <w:vAlign w:val="center"/>
           </w:tcPr>
           <w:p>
@@ -8532,7 +8609,6 @@
         <w:tc>
           <w:tcPr>
             <w:tcW w:w="0" w:type="auto"/>
-            <w:shd w:val="clear" w:color="auto" w:fill="auto"/>
             <w:vAlign w:val="center"/>
           </w:tcPr>
           <w:p>
@@ -8555,7 +8631,6 @@
         <w:tc>
           <w:tcPr>
             <w:tcW w:w="0" w:type="auto"/>
-            <w:shd w:val="clear" w:color="auto" w:fill="auto"/>
             <w:vAlign w:val="center"/>
           </w:tcPr>
           <w:p>
@@ -8573,7 +8648,6 @@
         <w:tc>
           <w:tcPr>
             <w:tcW w:w="0" w:type="auto"/>
-            <w:shd w:val="clear" w:color="auto" w:fill="auto"/>
             <w:vAlign w:val="center"/>
           </w:tcPr>
           <w:p>
@@ -8591,7 +8665,6 @@
         <w:tc>
           <w:tcPr>
             <w:tcW w:w="0" w:type="auto"/>
-            <w:shd w:val="clear" w:color="auto" w:fill="auto"/>
             <w:vAlign w:val="center"/>
           </w:tcPr>
           <w:p>
@@ -8614,7 +8687,6 @@
         <w:tc>
           <w:tcPr>
             <w:tcW w:w="0" w:type="auto"/>
-            <w:shd w:val="clear" w:color="auto" w:fill="auto"/>
             <w:vAlign w:val="center"/>
           </w:tcPr>
           <w:p>
@@ -8632,7 +8704,6 @@
         <w:tc>
           <w:tcPr>
             <w:tcW w:w="0" w:type="auto"/>
-            <w:shd w:val="clear" w:color="auto" w:fill="auto"/>
             <w:vAlign w:val="center"/>
           </w:tcPr>
           <w:p>
@@ -8650,7 +8721,6 @@
         <w:tc>
           <w:tcPr>
             <w:tcW w:w="0" w:type="auto"/>
-            <w:shd w:val="clear" w:color="auto" w:fill="auto"/>
             <w:vAlign w:val="center"/>
           </w:tcPr>
           <w:p>
@@ -8673,7 +8743,6 @@
         <w:tc>
           <w:tcPr>
             <w:tcW w:w="0" w:type="auto"/>
-            <w:shd w:val="clear" w:color="auto" w:fill="auto"/>
             <w:vAlign w:val="center"/>
           </w:tcPr>
           <w:p>
@@ -8691,7 +8760,6 @@
         <w:tc>
           <w:tcPr>
             <w:tcW w:w="0" w:type="auto"/>
-            <w:shd w:val="clear" w:color="auto" w:fill="auto"/>
             <w:vAlign w:val="center"/>
           </w:tcPr>
           <w:p>
@@ -8709,7 +8777,6 @@
         <w:tc>
           <w:tcPr>
             <w:tcW w:w="0" w:type="auto"/>
-            <w:shd w:val="clear" w:color="auto" w:fill="auto"/>
             <w:vAlign w:val="center"/>
           </w:tcPr>
           <w:p>
@@ -8743,7 +8810,6 @@
         <w:tc>
           <w:tcPr>
             <w:tcW w:w="0" w:type="auto"/>
-            <w:shd w:val="clear" w:color="auto" w:fill="auto"/>
             <w:vAlign w:val="center"/>
           </w:tcPr>
           <w:p>
@@ -8761,7 +8827,6 @@
         <w:tc>
           <w:tcPr>
             <w:tcW w:w="0" w:type="auto"/>
-            <w:shd w:val="clear" w:color="auto" w:fill="auto"/>
             <w:vAlign w:val="center"/>
           </w:tcPr>
           <w:p>
@@ -8779,7 +8844,6 @@
         <w:tc>
           <w:tcPr>
             <w:tcW w:w="0" w:type="auto"/>
-            <w:shd w:val="clear" w:color="auto" w:fill="auto"/>
             <w:vAlign w:val="center"/>
           </w:tcPr>
           <w:p>
@@ -8802,7 +8866,6 @@
         <w:tc>
           <w:tcPr>
             <w:tcW w:w="0" w:type="auto"/>
-            <w:shd w:val="clear" w:color="auto" w:fill="auto"/>
             <w:vAlign w:val="center"/>
           </w:tcPr>
           <w:p>
@@ -8820,7 +8883,6 @@
         <w:tc>
           <w:tcPr>
             <w:tcW w:w="0" w:type="auto"/>
-            <w:shd w:val="clear" w:color="auto" w:fill="auto"/>
             <w:vAlign w:val="center"/>
           </w:tcPr>
           <w:p>
@@ -8838,7 +8900,6 @@
         <w:tc>
           <w:tcPr>
             <w:tcW w:w="0" w:type="auto"/>
-            <w:shd w:val="clear" w:color="auto" w:fill="auto"/>
             <w:vAlign w:val="center"/>
           </w:tcPr>
           <w:p>
@@ -8861,7 +8922,7 @@
       </w:pPr>
       <w:r>
         <w:pict w14:anchorId="0F87BA7D">
-          <v:rect id="_x0000_i1075" style="width:6in;height:1.5pt" o:hralign="center" o:hrstd="t" o:hr="t" fillcolor="#a0a0a0" stroked="f"/>
+          <v:rect id="_x0000_i1071" style="width:6in;height:1.5pt" o:hralign="center" o:hrstd="t" o:hr="t" fillcolor="#a0a0a0" stroked="f"/>
         </w:pict>
       </w:r>
     </w:p>
@@ -8920,9 +8981,17 @@
         <w:rPr>
           <w:rStyle w:val="HTMLCode"/>
         </w:rPr>
-        <w:t>.productpulse.controller</w:t>
+        <w:t>.</w:t>
+      </w:r>
+      <w:proofErr w:type="gramStart"/>
+      <w:r>
+        <w:rPr>
+          <w:rStyle w:val="HTMLCode"/>
+        </w:rPr>
+        <w:t>productpulse.controller</w:t>
       </w:r>
       <w:proofErr w:type="spellEnd"/>
+      <w:proofErr w:type="gramEnd"/>
       <w:r>
         <w:t>)</w:t>
       </w:r>
@@ -9011,8 +9080,16 @@
         <w:rPr>
           <w:rStyle w:val="HTMLCode"/>
         </w:rPr>
-        <w:t>, role }</w:t>
-      </w:r>
+        <w:t xml:space="preserve">, </w:t>
+      </w:r>
+      <w:proofErr w:type="gramStart"/>
+      <w:r>
+        <w:rPr>
+          <w:rStyle w:val="HTMLCode"/>
+        </w:rPr>
+        <w:t>role }</w:t>
+      </w:r>
+      <w:proofErr w:type="gramEnd"/>
       <w:r>
         <w:t>.</w:t>
       </w:r>
@@ -9051,9 +9128,17 @@
         <w:rPr>
           <w:rStyle w:val="HTMLCode"/>
         </w:rPr>
-        <w:t>.productpulse.model</w:t>
+        <w:t>.</w:t>
+      </w:r>
+      <w:proofErr w:type="gramStart"/>
+      <w:r>
+        <w:rPr>
+          <w:rStyle w:val="HTMLCode"/>
+        </w:rPr>
+        <w:t>productpulse.model</w:t>
       </w:r>
       <w:proofErr w:type="spellEnd"/>
+      <w:proofErr w:type="gramEnd"/>
       <w:r>
         <w:t>)</w:t>
       </w:r>
@@ -9133,9 +9218,17 @@
         <w:rPr>
           <w:rStyle w:val="HTMLCode"/>
         </w:rPr>
-        <w:t>.productpulse.repo</w:t>
+        <w:t>.</w:t>
+      </w:r>
+      <w:proofErr w:type="gramStart"/>
+      <w:r>
+        <w:rPr>
+          <w:rStyle w:val="HTMLCode"/>
+        </w:rPr>
+        <w:t>productpulse.repo</w:t>
       </w:r>
       <w:proofErr w:type="spellEnd"/>
+      <w:proofErr w:type="gramEnd"/>
       <w:r>
         <w:t>)</w:t>
       </w:r>
@@ -9223,9 +9316,17 @@
         <w:rPr>
           <w:rStyle w:val="HTMLCode"/>
         </w:rPr>
-        <w:t>.productpulse.controller</w:t>
+        <w:t>.</w:t>
+      </w:r>
+      <w:proofErr w:type="gramStart"/>
+      <w:r>
+        <w:rPr>
+          <w:rStyle w:val="HTMLCode"/>
+        </w:rPr>
+        <w:t>productpulse.controller</w:t>
       </w:r>
       <w:proofErr w:type="spellEnd"/>
+      <w:proofErr w:type="gramEnd"/>
       <w:r>
         <w:t>)</w:t>
       </w:r>
@@ -9288,15 +9389,7 @@
         </w:numPr>
       </w:pPr>
       <w:r>
-        <w:t xml:space="preserve">Problem: frontend needed </w:t>
-      </w:r>
-      <w:proofErr w:type="gramStart"/>
-      <w:r>
-        <w:t>suggestions,</w:t>
-      </w:r>
-      <w:proofErr w:type="gramEnd"/>
-      <w:r>
-        <w:t xml:space="preserve"> backend only stored full list.</w:t>
+        <w:t>Problem: frontend needed suggestions, backend only stored full list.</w:t>
       </w:r>
     </w:p>
     <w:p>
@@ -9591,7 +9684,7 @@
     <w:p>
       <w:r>
         <w:pict w14:anchorId="7914E0BB">
-          <v:rect id="_x0000_i1071" style="width:0;height:1.5pt" o:hralign="center" o:hrstd="t" o:hr="t" fillcolor="#a0a0a0" stroked="f"/>
+          <v:rect id="_x0000_i1072" style="width:0;height:1.5pt" o:hralign="center" o:hrstd="t" o:hr="t" fillcolor="#a0a0a0" stroked="f"/>
         </w:pict>
       </w:r>
     </w:p>
@@ -9909,8 +10002,307 @@
     <w:p>
       <w:r>
         <w:pict w14:anchorId="30FE6922">
-          <v:rect id="_x0000_i1072" style="width:0;height:1.5pt" o:hralign="center" o:hrstd="t" o:hr="t" fillcolor="#a0a0a0" stroked="f"/>
+          <v:rect id="_x0000_i1073" style="width:0;height:1.5pt" o:hralign="center" o:hrstd="t" o:hr="t" fillcolor="#a0a0a0" stroked="f"/>
         </w:pict>
+      </w:r>
+    </w:p>
+    <w:p>
+      <w:pPr>
+        <w:spacing w:line="360" w:lineRule="auto"/>
+        <w:rPr>
+          <w:rFonts w:ascii="Times New Roman" w:hAnsi="Times New Roman" w:cs="Times New Roman"/>
+          <w:b/>
+          <w:bCs/>
+        </w:rPr>
+      </w:pPr>
+      <w:r>
+        <w:rPr>
+          <w:rFonts w:ascii="Times New Roman" w:hAnsi="Times New Roman" w:cs="Times New Roman"/>
+          <w:b/>
+          <w:bCs/>
+        </w:rPr>
+        <w:t>System Optimization Update — Async &amp; Caching Implementation</w:t>
+      </w:r>
+    </w:p>
+    <w:p>
+      <w:pPr>
+        <w:spacing w:line="360" w:lineRule="auto"/>
+        <w:rPr>
+          <w:rFonts w:ascii="Times New Roman" w:hAnsi="Times New Roman" w:cs="Times New Roman"/>
+        </w:rPr>
+      </w:pPr>
+      <w:r>
+        <w:rPr>
+          <w:rFonts w:ascii="Times New Roman" w:hAnsi="Times New Roman" w:cs="Times New Roman"/>
+          <w:b/>
+          <w:bCs/>
+        </w:rPr>
+        <w:t>Overview:</w:t>
+      </w:r>
+      <w:r>
+        <w:rPr>
+          <w:rFonts w:ascii="Times New Roman" w:hAnsi="Times New Roman" w:cs="Times New Roman"/>
+        </w:rPr>
+        <w:br/>
+        <w:t xml:space="preserve">Refactored the backend to improve performance, scalability, and response time by integrating </w:t>
+      </w:r>
+      <w:r>
+        <w:rPr>
+          <w:rFonts w:ascii="Times New Roman" w:hAnsi="Times New Roman" w:cs="Times New Roman"/>
+          <w:b/>
+          <w:bCs/>
+        </w:rPr>
+        <w:t>asynchronous execution</w:t>
+      </w:r>
+      <w:r>
+        <w:rPr>
+          <w:rFonts w:ascii="Times New Roman" w:hAnsi="Times New Roman" w:cs="Times New Roman"/>
+        </w:rPr>
+        <w:t xml:space="preserve"> and </w:t>
+      </w:r>
+      <w:r>
+        <w:rPr>
+          <w:rFonts w:ascii="Times New Roman" w:hAnsi="Times New Roman" w:cs="Times New Roman"/>
+          <w:b/>
+          <w:bCs/>
+        </w:rPr>
+        <w:t>Caffeine-based caching</w:t>
+      </w:r>
+      <w:r>
+        <w:rPr>
+          <w:rFonts w:ascii="Times New Roman" w:hAnsi="Times New Roman" w:cs="Times New Roman"/>
+        </w:rPr>
+        <w:t>.</w:t>
+      </w:r>
+    </w:p>
+    <w:p>
+      <w:pPr>
+        <w:spacing w:line="360" w:lineRule="auto"/>
+        <w:rPr>
+          <w:rFonts w:ascii="Times New Roman" w:hAnsi="Times New Roman" w:cs="Times New Roman"/>
+        </w:rPr>
+      </w:pPr>
+      <w:r>
+        <w:rPr>
+          <w:rFonts w:ascii="Times New Roman" w:hAnsi="Times New Roman" w:cs="Times New Roman"/>
+          <w:b/>
+          <w:bCs/>
+        </w:rPr>
+        <w:t>Key Updates:</w:t>
+      </w:r>
+    </w:p>
+    <w:p>
+      <w:pPr>
+        <w:numPr>
+          <w:ilvl w:val="0"/>
+          <w:numId w:val="34"/>
+        </w:numPr>
+        <w:spacing w:line="360" w:lineRule="auto"/>
+        <w:rPr>
+          <w:rFonts w:ascii="Times New Roman" w:hAnsi="Times New Roman" w:cs="Times New Roman"/>
+        </w:rPr>
+      </w:pPr>
+      <w:r>
+        <w:rPr>
+          <w:rFonts w:ascii="Times New Roman" w:hAnsi="Times New Roman" w:cs="Times New Roman"/>
+          <w:b/>
+          <w:bCs/>
+        </w:rPr>
+        <w:t>Asynchronous Processing (@EnableAsync):</w:t>
+      </w:r>
+      <w:r>
+        <w:rPr>
+          <w:rFonts w:ascii="Times New Roman" w:hAnsi="Times New Roman" w:cs="Times New Roman"/>
+        </w:rPr>
+        <w:br/>
+        <w:t xml:space="preserve">Implemented custom </w:t>
+      </w:r>
+      <w:proofErr w:type="spellStart"/>
+      <w:r>
+        <w:rPr>
+          <w:rFonts w:ascii="Times New Roman" w:hAnsi="Times New Roman" w:cs="Times New Roman"/>
+        </w:rPr>
+        <w:t>AsyncConfig</w:t>
+      </w:r>
+      <w:proofErr w:type="spellEnd"/>
+      <w:r>
+        <w:rPr>
+          <w:rFonts w:ascii="Times New Roman" w:hAnsi="Times New Roman" w:cs="Times New Roman"/>
+        </w:rPr>
+        <w:t xml:space="preserve"> with a thread pool executor to handle non-blocking tasks like email delivery and background processing.</w:t>
+      </w:r>
+      <w:r>
+        <w:rPr>
+          <w:rFonts w:ascii="Times New Roman" w:hAnsi="Times New Roman" w:cs="Times New Roman"/>
+        </w:rPr>
+        <w:br/>
+        <w:t>→ Increases responsiveness by offloading heavy operations to separate worker threads.</w:t>
+      </w:r>
+    </w:p>
+    <w:p>
+      <w:pPr>
+        <w:numPr>
+          <w:ilvl w:val="0"/>
+          <w:numId w:val="34"/>
+        </w:numPr>
+        <w:spacing w:line="360" w:lineRule="auto"/>
+        <w:rPr>
+          <w:rFonts w:ascii="Times New Roman" w:hAnsi="Times New Roman" w:cs="Times New Roman"/>
+        </w:rPr>
+      </w:pPr>
+      <w:r>
+        <w:rPr>
+          <w:rFonts w:ascii="Times New Roman" w:hAnsi="Times New Roman" w:cs="Times New Roman"/>
+          <w:b/>
+          <w:bCs/>
+        </w:rPr>
+        <w:t>Caffeine Cache Integration (@EnableCaching):</w:t>
+      </w:r>
+      <w:r>
+        <w:rPr>
+          <w:rFonts w:ascii="Times New Roman" w:hAnsi="Times New Roman" w:cs="Times New Roman"/>
+        </w:rPr>
+        <w:br/>
+        <w:t xml:space="preserve">Added </w:t>
+      </w:r>
+      <w:proofErr w:type="spellStart"/>
+      <w:r>
+        <w:rPr>
+          <w:rFonts w:ascii="Times New Roman" w:hAnsi="Times New Roman" w:cs="Times New Roman"/>
+        </w:rPr>
+        <w:t>CacheConfig</w:t>
+      </w:r>
+      <w:proofErr w:type="spellEnd"/>
+      <w:r>
+        <w:rPr>
+          <w:rFonts w:ascii="Times New Roman" w:hAnsi="Times New Roman" w:cs="Times New Roman"/>
+        </w:rPr>
+        <w:t xml:space="preserve"> with Caffeine for high-performance in-memory caching.</w:t>
+      </w:r>
+      <w:r>
+        <w:rPr>
+          <w:rFonts w:ascii="Times New Roman" w:hAnsi="Times New Roman" w:cs="Times New Roman"/>
+        </w:rPr>
+        <w:br/>
+        <w:t xml:space="preserve">→ Configured a 10-minute TTL and max size of 500 entries for frequently accessed entities (roles, company </w:t>
+      </w:r>
+      <w:r>
+        <w:rPr>
+          <w:rFonts w:ascii="Times New Roman" w:hAnsi="Times New Roman" w:cs="Times New Roman"/>
+        </w:rPr>
+        <w:lastRenderedPageBreak/>
+        <w:t>data, industry dropdowns).</w:t>
+      </w:r>
+      <w:r>
+        <w:rPr>
+          <w:rFonts w:ascii="Times New Roman" w:hAnsi="Times New Roman" w:cs="Times New Roman"/>
+        </w:rPr>
+        <w:br/>
+        <w:t>→ Reduced repeated database hits and improved endpoint response latency.</w:t>
+      </w:r>
+    </w:p>
+    <w:p>
+      <w:pPr>
+        <w:numPr>
+          <w:ilvl w:val="0"/>
+          <w:numId w:val="34"/>
+        </w:numPr>
+        <w:spacing w:line="360" w:lineRule="auto"/>
+        <w:rPr>
+          <w:rFonts w:ascii="Times New Roman" w:hAnsi="Times New Roman" w:cs="Times New Roman"/>
+        </w:rPr>
+      </w:pPr>
+      <w:r>
+        <w:rPr>
+          <w:rFonts w:ascii="Times New Roman" w:hAnsi="Times New Roman" w:cs="Times New Roman"/>
+          <w:b/>
+          <w:bCs/>
+        </w:rPr>
+        <w:t>Controller-Service Refactor:</w:t>
+      </w:r>
+      <w:r>
+        <w:rPr>
+          <w:rFonts w:ascii="Times New Roman" w:hAnsi="Times New Roman" w:cs="Times New Roman"/>
+        </w:rPr>
+        <w:br/>
+        <w:t>Moved business-heavy logic out of controllers into dedicated service methods.</w:t>
+      </w:r>
+      <w:r>
+        <w:rPr>
+          <w:rFonts w:ascii="Times New Roman" w:hAnsi="Times New Roman" w:cs="Times New Roman"/>
+        </w:rPr>
+        <w:br/>
+        <w:t>→ Improved code maintainability, readability, and separation of concerns.</w:t>
+      </w:r>
+    </w:p>
+    <w:p>
+      <w:pPr>
+        <w:spacing w:line="360" w:lineRule="auto"/>
+        <w:rPr>
+          <w:rFonts w:ascii="Times New Roman" w:hAnsi="Times New Roman" w:cs="Times New Roman"/>
+        </w:rPr>
+      </w:pPr>
+      <w:r>
+        <w:rPr>
+          <w:rFonts w:ascii="Times New Roman" w:hAnsi="Times New Roman" w:cs="Times New Roman"/>
+          <w:b/>
+          <w:bCs/>
+        </w:rPr>
+        <w:t>Result:</w:t>
+      </w:r>
+    </w:p>
+    <w:p>
+      <w:pPr>
+        <w:numPr>
+          <w:ilvl w:val="0"/>
+          <w:numId w:val="35"/>
+        </w:numPr>
+        <w:spacing w:line="360" w:lineRule="auto"/>
+        <w:rPr>
+          <w:rFonts w:ascii="Times New Roman" w:hAnsi="Times New Roman" w:cs="Times New Roman"/>
+        </w:rPr>
+      </w:pPr>
+      <w:r>
+        <w:rPr>
+          <w:rFonts w:ascii="Times New Roman" w:hAnsi="Times New Roman" w:cs="Times New Roman"/>
+        </w:rPr>
+        <w:t>Noticeable improvement in API response time.</w:t>
+      </w:r>
+    </w:p>
+    <w:p>
+      <w:pPr>
+        <w:numPr>
+          <w:ilvl w:val="0"/>
+          <w:numId w:val="35"/>
+        </w:numPr>
+        <w:spacing w:line="360" w:lineRule="auto"/>
+        <w:rPr>
+          <w:rFonts w:ascii="Times New Roman" w:hAnsi="Times New Roman" w:cs="Times New Roman"/>
+        </w:rPr>
+      </w:pPr>
+      <w:r>
+        <w:rPr>
+          <w:rFonts w:ascii="Times New Roman" w:hAnsi="Times New Roman" w:cs="Times New Roman"/>
+        </w:rPr>
+        <w:t>Cleaner architecture with modular, testable components.</w:t>
+      </w:r>
+    </w:p>
+    <w:p>
+      <w:pPr>
+        <w:numPr>
+          <w:ilvl w:val="0"/>
+          <w:numId w:val="35"/>
+        </w:numPr>
+        <w:spacing w:line="360" w:lineRule="auto"/>
+        <w:rPr>
+          <w:rFonts w:ascii="Times New Roman" w:hAnsi="Times New Roman" w:cs="Times New Roman"/>
+        </w:rPr>
+      </w:pPr>
+      <w:r>
+        <w:rPr>
+          <w:rFonts w:ascii="Times New Roman" w:hAnsi="Times New Roman" w:cs="Times New Roman"/>
+        </w:rPr>
+        <w:t>Backend now optimized for concurrent execution and faster data retrieval.</w:t>
       </w:r>
     </w:p>
     <w:p>
@@ -9938,7 +10330,7 @@
 </file>
 
 <file path=word/endnotes.xml><?xml version="1.0" encoding="utf-8"?>
-<w:endnotes xmlns:wpc="http://schemas.microsoft.com/office/word/2010/wordprocessingCanvas" xmlns:cx="http://schemas.microsoft.com/office/drawing/2014/chartex" xmlns:cx1="http://schemas.microsoft.com/office/drawing/2015/9/8/chartex" xmlns:cx2="http://schemas.microsoft.com/office/drawing/2015/10/21/chartex" xmlns:cx3="http://schemas.microsoft.com/office/drawing/2016/5/9/chartex" xmlns:cx4="http://schemas.microsoft.com/office/drawing/2016/5/10/chartex" xmlns:cx5="http://schemas.microsoft.com/office/drawing/2016/5/11/chartex" xmlns:cx6="http://schemas.microsoft.com/office/drawing/2016/5/12/chartex" xmlns:cx7="http://schemas.microsoft.com/office/drawing/2016/5/13/chartex" xmlns:cx8="http://schemas.microsoft.com/office/drawing/2016/5/14/chartex" xmlns:mc="http://schemas.openxmlformats.org/markup-compatibility/2006" xmlns:aink="http://schemas.microsoft.com/office/drawing/2016/ink" xmlns:am3d="http://schemas.microsoft.com/office/drawing/2017/model3d" xmlns:o="urn:schemas-microsoft-com:office:office" xmlns:oel="http://schemas.microsoft.com/office/2019/extlst" xmlns:r="http://schemas.openxmlformats.org/officeDocument/2006/relationships" xmlns:m="http://schemas.openxmlformats.org/officeDocument/2006/math" xmlns:v="urn:schemas-microsoft-com:vml" xmlns:wp14="http://schemas.microsoft.com/office/word/2010/wordprocessingDrawing" xmlns:wp="http://schemas.openxmlformats.org/drawingml/2006/wordprocessingDrawing" xmlns:w10="urn:schemas-microsoft-com:office:word" xmlns:w="http://schemas.openxmlformats.org/wordprocessingml/2006/main" xmlns:w14="http://schemas.microsoft.com/office/word/2010/wordml" xmlns:w15="http://schemas.microsoft.com/office/word/2012/wordml" xmlns:w16cex="http://schemas.microsoft.com/office/word/2018/wordml/cex" xmlns:w16cid="http://schemas.microsoft.com/office/word/2016/wordml/cid" xmlns:w16="http://schemas.microsoft.com/office/word/2018/wordml" xmlns:w16sdtdh="http://schemas.microsoft.com/office/word/2020/wordml/sdtdatahash" xmlns:w16se="http://schemas.microsoft.com/office/word/2015/wordml/symex" xmlns:wpg="http://schemas.microsoft.com/office/word/2010/wordprocessingGroup" xmlns:wpi="http://schemas.microsoft.com/office/word/2010/wordprocessingInk" xmlns:wne="http://schemas.microsoft.com/office/word/2006/wordml" xmlns:wps="http://schemas.microsoft.com/office/word/2010/wordprocessingShape" mc:Ignorable="w14 w15 w16se w16cid w16 w16cex w16sdtdh wp14">
+<w:endnotes xmlns:wpc="http://schemas.microsoft.com/office/word/2010/wordprocessingCanvas" xmlns:cx="http://schemas.microsoft.com/office/drawing/2014/chartex" xmlns:cx1="http://schemas.microsoft.com/office/drawing/2015/9/8/chartex" xmlns:cx2="http://schemas.microsoft.com/office/drawing/2015/10/21/chartex" xmlns:cx3="http://schemas.microsoft.com/office/drawing/2016/5/9/chartex" xmlns:cx4="http://schemas.microsoft.com/office/drawing/2016/5/10/chartex" xmlns:cx5="http://schemas.microsoft.com/office/drawing/2016/5/11/chartex" xmlns:cx6="http://schemas.microsoft.com/office/drawing/2016/5/12/chartex" xmlns:cx7="http://schemas.microsoft.com/office/drawing/2016/5/13/chartex" xmlns:cx8="http://schemas.microsoft.com/office/drawing/2016/5/14/chartex" xmlns:mc="http://schemas.openxmlformats.org/markup-compatibility/2006" xmlns:aink="http://schemas.microsoft.com/office/drawing/2016/ink" xmlns:am3d="http://schemas.microsoft.com/office/drawing/2017/model3d" xmlns:o="urn:schemas-microsoft-com:office:office" xmlns:oel="http://schemas.microsoft.com/office/2019/extlst" xmlns:r="http://schemas.openxmlformats.org/officeDocument/2006/relationships" xmlns:m="http://schemas.openxmlformats.org/officeDocument/2006/math" xmlns:v="urn:schemas-microsoft-com:vml" xmlns:wp14="http://schemas.microsoft.com/office/word/2010/wordprocessingDrawing" xmlns:wp="http://schemas.openxmlformats.org/drawingml/2006/wordprocessingDrawing" xmlns:w10="urn:schemas-microsoft-com:office:word" xmlns:w="http://schemas.openxmlformats.org/wordprocessingml/2006/main" xmlns:w14="http://schemas.microsoft.com/office/word/2010/wordml" xmlns:w15="http://schemas.microsoft.com/office/word/2012/wordml" xmlns:w16cex="http://schemas.microsoft.com/office/word/2018/wordml/cex" xmlns:w16cid="http://schemas.microsoft.com/office/word/2016/wordml/cid" xmlns:w16="http://schemas.microsoft.com/office/word/2018/wordml" xmlns:w16du="http://schemas.microsoft.com/office/word/2023/wordml/word16du" xmlns:w16sdtdh="http://schemas.microsoft.com/office/word/2020/wordml/sdtdatahash" xmlns:w16sdtfl="http://schemas.microsoft.com/office/word/2024/wordml/sdtformatlock" xmlns:w16se="http://schemas.microsoft.com/office/word/2015/wordml/symex" xmlns:wpg="http://schemas.microsoft.com/office/word/2010/wordprocessingGroup" xmlns:wpi="http://schemas.microsoft.com/office/word/2010/wordprocessingInk" xmlns:wne="http://schemas.microsoft.com/office/word/2006/wordml" xmlns:wps="http://schemas.microsoft.com/office/word/2010/wordprocessingShape" mc:Ignorable="w14 w15 w16se w16cid w16 w16cex w16sdtdh w16sdtfl w16du wp14">
   <w:endnote w:type="separator" w:id="-1">
     <w:p>
       <w:pPr>
@@ -9963,7 +10355,7 @@
 </file>
 
 <file path=word/footnotes.xml><?xml version="1.0" encoding="utf-8"?>
-<w:footnotes xmlns:wpc="http://schemas.microsoft.com/office/word/2010/wordprocessingCanvas" xmlns:cx="http://schemas.microsoft.com/office/drawing/2014/chartex" xmlns:cx1="http://schemas.microsoft.com/office/drawing/2015/9/8/chartex" xmlns:cx2="http://schemas.microsoft.com/office/drawing/2015/10/21/chartex" xmlns:cx3="http://schemas.microsoft.com/office/drawing/2016/5/9/chartex" xmlns:cx4="http://schemas.microsoft.com/office/drawing/2016/5/10/chartex" xmlns:cx5="http://schemas.microsoft.com/office/drawing/2016/5/11/chartex" xmlns:cx6="http://schemas.microsoft.com/office/drawing/2016/5/12/chartex" xmlns:cx7="http://schemas.microsoft.com/office/drawing/2016/5/13/chartex" xmlns:cx8="http://schemas.microsoft.com/office/drawing/2016/5/14/chartex" xmlns:mc="http://schemas.openxmlformats.org/markup-compatibility/2006" xmlns:aink="http://schemas.microsoft.com/office/drawing/2016/ink" xmlns:am3d="http://schemas.microsoft.com/office/drawing/2017/model3d" xmlns:o="urn:schemas-microsoft-com:office:office" xmlns:oel="http://schemas.microsoft.com/office/2019/extlst" xmlns:r="http://schemas.openxmlformats.org/officeDocument/2006/relationships" xmlns:m="http://schemas.openxmlformats.org/officeDocument/2006/math" xmlns:v="urn:schemas-microsoft-com:vml" xmlns:wp14="http://schemas.microsoft.com/office/word/2010/wordprocessingDrawing" xmlns:wp="http://schemas.openxmlformats.org/drawingml/2006/wordprocessingDrawing" xmlns:w10="urn:schemas-microsoft-com:office:word" xmlns:w="http://schemas.openxmlformats.org/wordprocessingml/2006/main" xmlns:w14="http://schemas.microsoft.com/office/word/2010/wordml" xmlns:w15="http://schemas.microsoft.com/office/word/2012/wordml" xmlns:w16cex="http://schemas.microsoft.com/office/word/2018/wordml/cex" xmlns:w16cid="http://schemas.microsoft.com/office/word/2016/wordml/cid" xmlns:w16="http://schemas.microsoft.com/office/word/2018/wordml" xmlns:w16sdtdh="http://schemas.microsoft.com/office/word/2020/wordml/sdtdatahash" xmlns:w16se="http://schemas.microsoft.com/office/word/2015/wordml/symex" xmlns:wpg="http://schemas.microsoft.com/office/word/2010/wordprocessingGroup" xmlns:wpi="http://schemas.microsoft.com/office/word/2010/wordprocessingInk" xmlns:wne="http://schemas.microsoft.com/office/word/2006/wordml" xmlns:wps="http://schemas.microsoft.com/office/word/2010/wordprocessingShape" mc:Ignorable="w14 w15 w16se w16cid w16 w16cex w16sdtdh wp14">
+<w:footnotes xmlns:wpc="http://schemas.microsoft.com/office/word/2010/wordprocessingCanvas" xmlns:cx="http://schemas.microsoft.com/office/drawing/2014/chartex" xmlns:cx1="http://schemas.microsoft.com/office/drawing/2015/9/8/chartex" xmlns:cx2="http://schemas.microsoft.com/office/drawing/2015/10/21/chartex" xmlns:cx3="http://schemas.microsoft.com/office/drawing/2016/5/9/chartex" xmlns:cx4="http://schemas.microsoft.com/office/drawing/2016/5/10/chartex" xmlns:cx5="http://schemas.microsoft.com/office/drawing/2016/5/11/chartex" xmlns:cx6="http://schemas.microsoft.com/office/drawing/2016/5/12/chartex" xmlns:cx7="http://schemas.microsoft.com/office/drawing/2016/5/13/chartex" xmlns:cx8="http://schemas.microsoft.com/office/drawing/2016/5/14/chartex" xmlns:mc="http://schemas.openxmlformats.org/markup-compatibility/2006" xmlns:aink="http://schemas.microsoft.com/office/drawing/2016/ink" xmlns:am3d="http://schemas.microsoft.com/office/drawing/2017/model3d" xmlns:o="urn:schemas-microsoft-com:office:office" xmlns:oel="http://schemas.microsoft.com/office/2019/extlst" xmlns:r="http://schemas.openxmlformats.org/officeDocument/2006/relationships" xmlns:m="http://schemas.openxmlformats.org/officeDocument/2006/math" xmlns:v="urn:schemas-microsoft-com:vml" xmlns:wp14="http://schemas.microsoft.com/office/word/2010/wordprocessingDrawing" xmlns:wp="http://schemas.openxmlformats.org/drawingml/2006/wordprocessingDrawing" xmlns:w10="urn:schemas-microsoft-com:office:word" xmlns:w="http://schemas.openxmlformats.org/wordprocessingml/2006/main" xmlns:w14="http://schemas.microsoft.com/office/word/2010/wordml" xmlns:w15="http://schemas.microsoft.com/office/word/2012/wordml" xmlns:w16cex="http://schemas.microsoft.com/office/word/2018/wordml/cex" xmlns:w16cid="http://schemas.microsoft.com/office/word/2016/wordml/cid" xmlns:w16="http://schemas.microsoft.com/office/word/2018/wordml" xmlns:w16du="http://schemas.microsoft.com/office/word/2023/wordml/word16du" xmlns:w16sdtdh="http://schemas.microsoft.com/office/word/2020/wordml/sdtdatahash" xmlns:w16sdtfl="http://schemas.microsoft.com/office/word/2024/wordml/sdtformatlock" xmlns:w16se="http://schemas.microsoft.com/office/word/2015/wordml/symex" xmlns:wpg="http://schemas.microsoft.com/office/word/2010/wordprocessingGroup" xmlns:wpi="http://schemas.microsoft.com/office/word/2010/wordprocessingInk" xmlns:wne="http://schemas.microsoft.com/office/word/2006/wordml" xmlns:wps="http://schemas.microsoft.com/office/word/2010/wordprocessingShape" mc:Ignorable="w14 w15 w16se w16cid w16 w16cex w16sdtdh w16sdtfl w16du wp14">
   <w:footnote w:type="separator" w:id="-1">
     <w:p>
       <w:pPr>
@@ -9988,7 +10380,7 @@
 </file>
 
 <file path=word/numbering.xml><?xml version="1.0" encoding="utf-8"?>
-<w:numbering xmlns:wpc="http://schemas.microsoft.com/office/word/2010/wordprocessingCanvas" xmlns:cx="http://schemas.microsoft.com/office/drawing/2014/chartex" xmlns:cx1="http://schemas.microsoft.com/office/drawing/2015/9/8/chartex" xmlns:cx2="http://schemas.microsoft.com/office/drawing/2015/10/21/chartex" xmlns:cx3="http://schemas.microsoft.com/office/drawing/2016/5/9/chartex" xmlns:cx4="http://schemas.microsoft.com/office/drawing/2016/5/10/chartex" xmlns:cx5="http://schemas.microsoft.com/office/drawing/2016/5/11/chartex" xmlns:cx6="http://schemas.microsoft.com/office/drawing/2016/5/12/chartex" xmlns:cx7="http://schemas.microsoft.com/office/drawing/2016/5/13/chartex" xmlns:cx8="http://schemas.microsoft.com/office/drawing/2016/5/14/chartex" xmlns:mc="http://schemas.openxmlformats.org/markup-compatibility/2006" xmlns:aink="http://schemas.microsoft.com/office/drawing/2016/ink" xmlns:am3d="http://schemas.microsoft.com/office/drawing/2017/model3d" xmlns:o="urn:schemas-microsoft-com:office:office" xmlns:oel="http://schemas.microsoft.com/office/2019/extlst" xmlns:r="http://schemas.openxmlformats.org/officeDocument/2006/relationships" xmlns:m="http://schemas.openxmlformats.org/officeDocument/2006/math" xmlns:v="urn:schemas-microsoft-com:vml" xmlns:wp14="http://schemas.microsoft.com/office/word/2010/wordprocessingDrawing" xmlns:wp="http://schemas.openxmlformats.org/drawingml/2006/wordprocessingDrawing" xmlns:w10="urn:schemas-microsoft-com:office:word" xmlns:w="http://schemas.openxmlformats.org/wordprocessingml/2006/main" xmlns:w14="http://schemas.microsoft.com/office/word/2010/wordml" xmlns:w15="http://schemas.microsoft.com/office/word/2012/wordml" xmlns:w16cex="http://schemas.microsoft.com/office/word/2018/wordml/cex" xmlns:w16cid="http://schemas.microsoft.com/office/word/2016/wordml/cid" xmlns:w16="http://schemas.microsoft.com/office/word/2018/wordml" xmlns:w16sdtdh="http://schemas.microsoft.com/office/word/2020/wordml/sdtdatahash" xmlns:w16se="http://schemas.microsoft.com/office/word/2015/wordml/symex" xmlns:wpg="http://schemas.microsoft.com/office/word/2010/wordprocessingGroup" xmlns:wpi="http://schemas.microsoft.com/office/word/2010/wordprocessingInk" xmlns:wne="http://schemas.microsoft.com/office/word/2006/wordml" xmlns:wps="http://schemas.microsoft.com/office/word/2010/wordprocessingShape" mc:Ignorable="w14 w15 w16se w16cid w16 w16cex w16sdtdh wp14">
+<w:numbering xmlns:wpc="http://schemas.microsoft.com/office/word/2010/wordprocessingCanvas" xmlns:cx="http://schemas.microsoft.com/office/drawing/2014/chartex" xmlns:cx1="http://schemas.microsoft.com/office/drawing/2015/9/8/chartex" xmlns:cx2="http://schemas.microsoft.com/office/drawing/2015/10/21/chartex" xmlns:cx3="http://schemas.microsoft.com/office/drawing/2016/5/9/chartex" xmlns:cx4="http://schemas.microsoft.com/office/drawing/2016/5/10/chartex" xmlns:cx5="http://schemas.microsoft.com/office/drawing/2016/5/11/chartex" xmlns:cx6="http://schemas.microsoft.com/office/drawing/2016/5/12/chartex" xmlns:cx7="http://schemas.microsoft.com/office/drawing/2016/5/13/chartex" xmlns:cx8="http://schemas.microsoft.com/office/drawing/2016/5/14/chartex" xmlns:mc="http://schemas.openxmlformats.org/markup-compatibility/2006" xmlns:aink="http://schemas.microsoft.com/office/drawing/2016/ink" xmlns:am3d="http://schemas.microsoft.com/office/drawing/2017/model3d" xmlns:o="urn:schemas-microsoft-com:office:office" xmlns:oel="http://schemas.microsoft.com/office/2019/extlst" xmlns:r="http://schemas.openxmlformats.org/officeDocument/2006/relationships" xmlns:m="http://schemas.openxmlformats.org/officeDocument/2006/math" xmlns:v="urn:schemas-microsoft-com:vml" xmlns:wp14="http://schemas.microsoft.com/office/word/2010/wordprocessingDrawing" xmlns:wp="http://schemas.openxmlformats.org/drawingml/2006/wordprocessingDrawing" xmlns:w10="urn:schemas-microsoft-com:office:word" xmlns:w="http://schemas.openxmlformats.org/wordprocessingml/2006/main" xmlns:w14="http://schemas.microsoft.com/office/word/2010/wordml" xmlns:w15="http://schemas.microsoft.com/office/word/2012/wordml" xmlns:w16cex="http://schemas.microsoft.com/office/word/2018/wordml/cex" xmlns:w16cid="http://schemas.microsoft.com/office/word/2016/wordml/cid" xmlns:w16="http://schemas.microsoft.com/office/word/2018/wordml" xmlns:w16du="http://schemas.microsoft.com/office/word/2023/wordml/word16du" xmlns:w16sdtdh="http://schemas.microsoft.com/office/word/2020/wordml/sdtdatahash" xmlns:w16sdtfl="http://schemas.microsoft.com/office/word/2024/wordml/sdtformatlock" xmlns:w16se="http://schemas.microsoft.com/office/word/2015/wordml/symex" xmlns:wpg="http://schemas.microsoft.com/office/word/2010/wordprocessingGroup" xmlns:wpi="http://schemas.microsoft.com/office/word/2010/wordprocessingInk" xmlns:wne="http://schemas.microsoft.com/office/word/2006/wordml" xmlns:wps="http://schemas.microsoft.com/office/word/2010/wordprocessingShape" mc:Ignorable="w14 w15 w16se w16cid w16 w16cex w16sdtdh w16sdtfl w16du wp14">
   <w:abstractNum w:abstractNumId="0" w15:restartNumberingAfterBreak="0">
     <w:nsid w:val="046A7EEE"/>
     <w:multiLevelType w:val="multilevel"/>
@@ -13167,6 +13559,155 @@
     </w:lvl>
   </w:abstractNum>
   <w:abstractNum w:abstractNumId="22" w15:restartNumberingAfterBreak="0">
+    <w:nsid w:val="44E265B6"/>
+    <w:multiLevelType w:val="multilevel"/>
+    <w:tmpl w:val="64684EB4"/>
+    <w:lvl w:ilvl="0">
+      <w:start w:val="1"/>
+      <w:numFmt w:val="bullet"/>
+      <w:lvlText w:val=""/>
+      <w:lvlJc w:val="left"/>
+      <w:pPr>
+        <w:tabs>
+          <w:tab w:val="num" w:pos="720"/>
+        </w:tabs>
+        <w:ind w:left="720" w:hanging="360"/>
+      </w:pPr>
+      <w:rPr>
+        <w:rFonts w:ascii="Symbol" w:hAnsi="Symbol" w:hint="default"/>
+        <w:sz w:val="20"/>
+      </w:rPr>
+    </w:lvl>
+    <w:lvl w:ilvl="1" w:tentative="1">
+      <w:start w:val="1"/>
+      <w:numFmt w:val="bullet"/>
+      <w:lvlText w:val="o"/>
+      <w:lvlJc w:val="left"/>
+      <w:pPr>
+        <w:tabs>
+          <w:tab w:val="num" w:pos="1440"/>
+        </w:tabs>
+        <w:ind w:left="1440" w:hanging="360"/>
+      </w:pPr>
+      <w:rPr>
+        <w:rFonts w:ascii="Courier New" w:hAnsi="Courier New" w:hint="default"/>
+        <w:sz w:val="20"/>
+      </w:rPr>
+    </w:lvl>
+    <w:lvl w:ilvl="2" w:tentative="1">
+      <w:start w:val="1"/>
+      <w:numFmt w:val="bullet"/>
+      <w:lvlText w:val=""/>
+      <w:lvlJc w:val="left"/>
+      <w:pPr>
+        <w:tabs>
+          <w:tab w:val="num" w:pos="2160"/>
+        </w:tabs>
+        <w:ind w:left="2160" w:hanging="360"/>
+      </w:pPr>
+      <w:rPr>
+        <w:rFonts w:ascii="Wingdings" w:hAnsi="Wingdings" w:hint="default"/>
+        <w:sz w:val="20"/>
+      </w:rPr>
+    </w:lvl>
+    <w:lvl w:ilvl="3" w:tentative="1">
+      <w:start w:val="1"/>
+      <w:numFmt w:val="bullet"/>
+      <w:lvlText w:val=""/>
+      <w:lvlJc w:val="left"/>
+      <w:pPr>
+        <w:tabs>
+          <w:tab w:val="num" w:pos="2880"/>
+        </w:tabs>
+        <w:ind w:left="2880" w:hanging="360"/>
+      </w:pPr>
+      <w:rPr>
+        <w:rFonts w:ascii="Wingdings" w:hAnsi="Wingdings" w:hint="default"/>
+        <w:sz w:val="20"/>
+      </w:rPr>
+    </w:lvl>
+    <w:lvl w:ilvl="4" w:tentative="1">
+      <w:start w:val="1"/>
+      <w:numFmt w:val="bullet"/>
+      <w:lvlText w:val=""/>
+      <w:lvlJc w:val="left"/>
+      <w:pPr>
+        <w:tabs>
+          <w:tab w:val="num" w:pos="3600"/>
+        </w:tabs>
+        <w:ind w:left="3600" w:hanging="360"/>
+      </w:pPr>
+      <w:rPr>
+        <w:rFonts w:ascii="Wingdings" w:hAnsi="Wingdings" w:hint="default"/>
+        <w:sz w:val="20"/>
+      </w:rPr>
+    </w:lvl>
+    <w:lvl w:ilvl="5" w:tentative="1">
+      <w:start w:val="1"/>
+      <w:numFmt w:val="bullet"/>
+      <w:lvlText w:val=""/>
+      <w:lvlJc w:val="left"/>
+      <w:pPr>
+        <w:tabs>
+          <w:tab w:val="num" w:pos="4320"/>
+        </w:tabs>
+        <w:ind w:left="4320" w:hanging="360"/>
+      </w:pPr>
+      <w:rPr>
+        <w:rFonts w:ascii="Wingdings" w:hAnsi="Wingdings" w:hint="default"/>
+        <w:sz w:val="20"/>
+      </w:rPr>
+    </w:lvl>
+    <w:lvl w:ilvl="6" w:tentative="1">
+      <w:start w:val="1"/>
+      <w:numFmt w:val="bullet"/>
+      <w:lvlText w:val=""/>
+      <w:lvlJc w:val="left"/>
+      <w:pPr>
+        <w:tabs>
+          <w:tab w:val="num" w:pos="5040"/>
+        </w:tabs>
+        <w:ind w:left="5040" w:hanging="360"/>
+      </w:pPr>
+      <w:rPr>
+        <w:rFonts w:ascii="Wingdings" w:hAnsi="Wingdings" w:hint="default"/>
+        <w:sz w:val="20"/>
+      </w:rPr>
+    </w:lvl>
+    <w:lvl w:ilvl="7" w:tentative="1">
+      <w:start w:val="1"/>
+      <w:numFmt w:val="bullet"/>
+      <w:lvlText w:val=""/>
+      <w:lvlJc w:val="left"/>
+      <w:pPr>
+        <w:tabs>
+          <w:tab w:val="num" w:pos="5760"/>
+        </w:tabs>
+        <w:ind w:left="5760" w:hanging="360"/>
+      </w:pPr>
+      <w:rPr>
+        <w:rFonts w:ascii="Wingdings" w:hAnsi="Wingdings" w:hint="default"/>
+        <w:sz w:val="20"/>
+      </w:rPr>
+    </w:lvl>
+    <w:lvl w:ilvl="8" w:tentative="1">
+      <w:start w:val="1"/>
+      <w:numFmt w:val="bullet"/>
+      <w:lvlText w:val=""/>
+      <w:lvlJc w:val="left"/>
+      <w:pPr>
+        <w:tabs>
+          <w:tab w:val="num" w:pos="6480"/>
+        </w:tabs>
+        <w:ind w:left="6480" w:hanging="360"/>
+      </w:pPr>
+      <w:rPr>
+        <w:rFonts w:ascii="Wingdings" w:hAnsi="Wingdings" w:hint="default"/>
+        <w:sz w:val="20"/>
+      </w:rPr>
+    </w:lvl>
+  </w:abstractNum>
+  <w:abstractNum w:abstractNumId="23" w15:restartNumberingAfterBreak="0">
     <w:nsid w:val="4C872B40"/>
     <w:multiLevelType w:val="multilevel"/>
     <w:tmpl w:val="F73E8DBC"/>
@@ -13315,7 +13856,7 @@
       </w:rPr>
     </w:lvl>
   </w:abstractNum>
-  <w:abstractNum w:abstractNumId="23" w15:restartNumberingAfterBreak="0">
+  <w:abstractNum w:abstractNumId="24" w15:restartNumberingAfterBreak="0">
     <w:nsid w:val="4D1434E3"/>
     <w:multiLevelType w:val="multilevel"/>
     <w:tmpl w:val="2A846552"/>
@@ -13464,7 +14005,7 @@
       </w:rPr>
     </w:lvl>
   </w:abstractNum>
-  <w:abstractNum w:abstractNumId="24" w15:restartNumberingAfterBreak="0">
+  <w:abstractNum w:abstractNumId="25" w15:restartNumberingAfterBreak="0">
     <w:nsid w:val="5CEB6760"/>
     <w:multiLevelType w:val="multilevel"/>
     <w:tmpl w:val="3B06DAD4"/>
@@ -13613,7 +14154,7 @@
       </w:rPr>
     </w:lvl>
   </w:abstractNum>
-  <w:abstractNum w:abstractNumId="25" w15:restartNumberingAfterBreak="0">
+  <w:abstractNum w:abstractNumId="26" w15:restartNumberingAfterBreak="0">
     <w:nsid w:val="5F576381"/>
     <w:multiLevelType w:val="multilevel"/>
     <w:tmpl w:val="5F576381"/>
@@ -13730,7 +14271,7 @@
       </w:pPr>
     </w:lvl>
   </w:abstractNum>
-  <w:abstractNum w:abstractNumId="26" w15:restartNumberingAfterBreak="0">
+  <w:abstractNum w:abstractNumId="27" w15:restartNumberingAfterBreak="0">
     <w:nsid w:val="62CC0A33"/>
     <w:multiLevelType w:val="multilevel"/>
     <w:tmpl w:val="62CC0A33"/>
@@ -13879,7 +14420,7 @@
       </w:rPr>
     </w:lvl>
   </w:abstractNum>
-  <w:abstractNum w:abstractNumId="27" w15:restartNumberingAfterBreak="0">
+  <w:abstractNum w:abstractNumId="28" w15:restartNumberingAfterBreak="0">
     <w:nsid w:val="63417F92"/>
     <w:multiLevelType w:val="multilevel"/>
     <w:tmpl w:val="63417F92"/>
@@ -14028,7 +14569,7 @@
       </w:rPr>
     </w:lvl>
   </w:abstractNum>
-  <w:abstractNum w:abstractNumId="28" w15:restartNumberingAfterBreak="0">
+  <w:abstractNum w:abstractNumId="29" w15:restartNumberingAfterBreak="0">
     <w:nsid w:val="69A6531E"/>
     <w:multiLevelType w:val="multilevel"/>
     <w:tmpl w:val="69A6531E"/>
@@ -14177,7 +14718,7 @@
       </w:rPr>
     </w:lvl>
   </w:abstractNum>
-  <w:abstractNum w:abstractNumId="29" w15:restartNumberingAfterBreak="0">
+  <w:abstractNum w:abstractNumId="30" w15:restartNumberingAfterBreak="0">
     <w:nsid w:val="6D4548CD"/>
     <w:multiLevelType w:val="multilevel"/>
     <w:tmpl w:val="6D4548CD"/>
@@ -14290,7 +14831,7 @@
       </w:pPr>
     </w:lvl>
   </w:abstractNum>
-  <w:abstractNum w:abstractNumId="30" w15:restartNumberingAfterBreak="0">
+  <w:abstractNum w:abstractNumId="31" w15:restartNumberingAfterBreak="0">
     <w:nsid w:val="6D7D166E"/>
     <w:multiLevelType w:val="multilevel"/>
     <w:tmpl w:val="6D7D166E"/>
@@ -14439,7 +14980,156 @@
       </w:rPr>
     </w:lvl>
   </w:abstractNum>
-  <w:abstractNum w:abstractNumId="31" w15:restartNumberingAfterBreak="0">
+  <w:abstractNum w:abstractNumId="32" w15:restartNumberingAfterBreak="0">
+    <w:nsid w:val="771066D8"/>
+    <w:multiLevelType w:val="multilevel"/>
+    <w:tmpl w:val="4E4C1AF4"/>
+    <w:lvl w:ilvl="0">
+      <w:start w:val="1"/>
+      <w:numFmt w:val="bullet"/>
+      <w:lvlText w:val=""/>
+      <w:lvlJc w:val="left"/>
+      <w:pPr>
+        <w:tabs>
+          <w:tab w:val="num" w:pos="720"/>
+        </w:tabs>
+        <w:ind w:left="720" w:hanging="360"/>
+      </w:pPr>
+      <w:rPr>
+        <w:rFonts w:ascii="Symbol" w:hAnsi="Symbol" w:hint="default"/>
+        <w:sz w:val="20"/>
+      </w:rPr>
+    </w:lvl>
+    <w:lvl w:ilvl="1" w:tentative="1">
+      <w:start w:val="1"/>
+      <w:numFmt w:val="bullet"/>
+      <w:lvlText w:val="o"/>
+      <w:lvlJc w:val="left"/>
+      <w:pPr>
+        <w:tabs>
+          <w:tab w:val="num" w:pos="1440"/>
+        </w:tabs>
+        <w:ind w:left="1440" w:hanging="360"/>
+      </w:pPr>
+      <w:rPr>
+        <w:rFonts w:ascii="Courier New" w:hAnsi="Courier New" w:hint="default"/>
+        <w:sz w:val="20"/>
+      </w:rPr>
+    </w:lvl>
+    <w:lvl w:ilvl="2" w:tentative="1">
+      <w:start w:val="1"/>
+      <w:numFmt w:val="bullet"/>
+      <w:lvlText w:val=""/>
+      <w:lvlJc w:val="left"/>
+      <w:pPr>
+        <w:tabs>
+          <w:tab w:val="num" w:pos="2160"/>
+        </w:tabs>
+        <w:ind w:left="2160" w:hanging="360"/>
+      </w:pPr>
+      <w:rPr>
+        <w:rFonts w:ascii="Wingdings" w:hAnsi="Wingdings" w:hint="default"/>
+        <w:sz w:val="20"/>
+      </w:rPr>
+    </w:lvl>
+    <w:lvl w:ilvl="3" w:tentative="1">
+      <w:start w:val="1"/>
+      <w:numFmt w:val="bullet"/>
+      <w:lvlText w:val=""/>
+      <w:lvlJc w:val="left"/>
+      <w:pPr>
+        <w:tabs>
+          <w:tab w:val="num" w:pos="2880"/>
+        </w:tabs>
+        <w:ind w:left="2880" w:hanging="360"/>
+      </w:pPr>
+      <w:rPr>
+        <w:rFonts w:ascii="Wingdings" w:hAnsi="Wingdings" w:hint="default"/>
+        <w:sz w:val="20"/>
+      </w:rPr>
+    </w:lvl>
+    <w:lvl w:ilvl="4" w:tentative="1">
+      <w:start w:val="1"/>
+      <w:numFmt w:val="bullet"/>
+      <w:lvlText w:val=""/>
+      <w:lvlJc w:val="left"/>
+      <w:pPr>
+        <w:tabs>
+          <w:tab w:val="num" w:pos="3600"/>
+        </w:tabs>
+        <w:ind w:left="3600" w:hanging="360"/>
+      </w:pPr>
+      <w:rPr>
+        <w:rFonts w:ascii="Wingdings" w:hAnsi="Wingdings" w:hint="default"/>
+        <w:sz w:val="20"/>
+      </w:rPr>
+    </w:lvl>
+    <w:lvl w:ilvl="5" w:tentative="1">
+      <w:start w:val="1"/>
+      <w:numFmt w:val="bullet"/>
+      <w:lvlText w:val=""/>
+      <w:lvlJc w:val="left"/>
+      <w:pPr>
+        <w:tabs>
+          <w:tab w:val="num" w:pos="4320"/>
+        </w:tabs>
+        <w:ind w:left="4320" w:hanging="360"/>
+      </w:pPr>
+      <w:rPr>
+        <w:rFonts w:ascii="Wingdings" w:hAnsi="Wingdings" w:hint="default"/>
+        <w:sz w:val="20"/>
+      </w:rPr>
+    </w:lvl>
+    <w:lvl w:ilvl="6" w:tentative="1">
+      <w:start w:val="1"/>
+      <w:numFmt w:val="bullet"/>
+      <w:lvlText w:val=""/>
+      <w:lvlJc w:val="left"/>
+      <w:pPr>
+        <w:tabs>
+          <w:tab w:val="num" w:pos="5040"/>
+        </w:tabs>
+        <w:ind w:left="5040" w:hanging="360"/>
+      </w:pPr>
+      <w:rPr>
+        <w:rFonts w:ascii="Wingdings" w:hAnsi="Wingdings" w:hint="default"/>
+        <w:sz w:val="20"/>
+      </w:rPr>
+    </w:lvl>
+    <w:lvl w:ilvl="7" w:tentative="1">
+      <w:start w:val="1"/>
+      <w:numFmt w:val="bullet"/>
+      <w:lvlText w:val=""/>
+      <w:lvlJc w:val="left"/>
+      <w:pPr>
+        <w:tabs>
+          <w:tab w:val="num" w:pos="5760"/>
+        </w:tabs>
+        <w:ind w:left="5760" w:hanging="360"/>
+      </w:pPr>
+      <w:rPr>
+        <w:rFonts w:ascii="Wingdings" w:hAnsi="Wingdings" w:hint="default"/>
+        <w:sz w:val="20"/>
+      </w:rPr>
+    </w:lvl>
+    <w:lvl w:ilvl="8" w:tentative="1">
+      <w:start w:val="1"/>
+      <w:numFmt w:val="bullet"/>
+      <w:lvlText w:val=""/>
+      <w:lvlJc w:val="left"/>
+      <w:pPr>
+        <w:tabs>
+          <w:tab w:val="num" w:pos="6480"/>
+        </w:tabs>
+        <w:ind w:left="6480" w:hanging="360"/>
+      </w:pPr>
+      <w:rPr>
+        <w:rFonts w:ascii="Wingdings" w:hAnsi="Wingdings" w:hint="default"/>
+        <w:sz w:val="20"/>
+      </w:rPr>
+    </w:lvl>
+  </w:abstractNum>
+  <w:abstractNum w:abstractNumId="33" w15:restartNumberingAfterBreak="0">
     <w:nsid w:val="7759540E"/>
     <w:multiLevelType w:val="multilevel"/>
     <w:tmpl w:val="7759540E"/>
@@ -14588,7 +15278,7 @@
       </w:rPr>
     </w:lvl>
   </w:abstractNum>
-  <w:abstractNum w:abstractNumId="32" w15:restartNumberingAfterBreak="0">
+  <w:abstractNum w:abstractNumId="34" w15:restartNumberingAfterBreak="0">
     <w:nsid w:val="786B6F95"/>
     <w:multiLevelType w:val="multilevel"/>
     <w:tmpl w:val="786B6F95"/>
@@ -14738,7 +15428,7 @@
     </w:lvl>
   </w:abstractNum>
   <w:num w:numId="1" w16cid:durableId="1115517606">
-    <w:abstractNumId w:val="29"/>
+    <w:abstractNumId w:val="30"/>
   </w:num>
   <w:num w:numId="2" w16cid:durableId="454368529">
     <w:abstractNumId w:val="21"/>
@@ -14750,10 +15440,10 @@
     <w:abstractNumId w:val="12"/>
   </w:num>
   <w:num w:numId="5" w16cid:durableId="182911768">
-    <w:abstractNumId w:val="31"/>
+    <w:abstractNumId w:val="33"/>
   </w:num>
   <w:num w:numId="6" w16cid:durableId="613832209">
-    <w:abstractNumId w:val="25"/>
+    <w:abstractNumId w:val="26"/>
   </w:num>
   <w:num w:numId="7" w16cid:durableId="995232405">
     <w:abstractNumId w:val="13"/>
@@ -14765,7 +15455,7 @@
     <w:abstractNumId w:val="6"/>
   </w:num>
   <w:num w:numId="10" w16cid:durableId="2035379201">
-    <w:abstractNumId w:val="32"/>
+    <w:abstractNumId w:val="34"/>
   </w:num>
   <w:num w:numId="11" w16cid:durableId="1477843548">
     <w:abstractNumId w:val="11"/>
@@ -14792,16 +15482,16 @@
     <w:abstractNumId w:val="20"/>
   </w:num>
   <w:num w:numId="19" w16cid:durableId="1647660082">
-    <w:abstractNumId w:val="27"/>
+    <w:abstractNumId w:val="28"/>
   </w:num>
   <w:num w:numId="20" w16cid:durableId="2123303656">
     <w:abstractNumId w:val="10"/>
   </w:num>
   <w:num w:numId="21" w16cid:durableId="1738622877">
-    <w:abstractNumId w:val="28"/>
+    <w:abstractNumId w:val="29"/>
   </w:num>
   <w:num w:numId="22" w16cid:durableId="1739479249">
-    <w:abstractNumId w:val="30"/>
+    <w:abstractNumId w:val="31"/>
   </w:num>
   <w:num w:numId="23" w16cid:durableId="261306416">
     <w:abstractNumId w:val="15"/>
@@ -14810,13 +15500,13 @@
     <w:abstractNumId w:val="5"/>
   </w:num>
   <w:num w:numId="25" w16cid:durableId="1525443157">
-    <w:abstractNumId w:val="26"/>
+    <w:abstractNumId w:val="27"/>
   </w:num>
   <w:num w:numId="26" w16cid:durableId="935089829">
     <w:abstractNumId w:val="7"/>
   </w:num>
   <w:num w:numId="27" w16cid:durableId="1958948241">
-    <w:abstractNumId w:val="22"/>
+    <w:abstractNumId w:val="23"/>
   </w:num>
   <w:num w:numId="28" w16cid:durableId="1276592632">
     <w:abstractNumId w:val="4"/>
@@ -14825,22 +15515,28 @@
     <w:abstractNumId w:val="0"/>
   </w:num>
   <w:num w:numId="30" w16cid:durableId="262302140">
-    <w:abstractNumId w:val="24"/>
+    <w:abstractNumId w:val="25"/>
   </w:num>
   <w:num w:numId="31" w16cid:durableId="625545821">
     <w:abstractNumId w:val="18"/>
   </w:num>
   <w:num w:numId="32" w16cid:durableId="606736677">
-    <w:abstractNumId w:val="23"/>
+    <w:abstractNumId w:val="24"/>
   </w:num>
   <w:num w:numId="33" w16cid:durableId="1661232352">
     <w:abstractNumId w:val="17"/>
+  </w:num>
+  <w:num w:numId="34" w16cid:durableId="640766118">
+    <w:abstractNumId w:val="32"/>
+  </w:num>
+  <w:num w:numId="35" w16cid:durableId="1713111512">
+    <w:abstractNumId w:val="22"/>
   </w:num>
 </w:numbering>
 </file>
 
 <file path=word/styles.xml><?xml version="1.0" encoding="utf-8"?>
-<w:styles xmlns:mc="http://schemas.openxmlformats.org/markup-compatibility/2006" xmlns:r="http://schemas.openxmlformats.org/officeDocument/2006/relationships" xmlns:w="http://schemas.openxmlformats.org/wordprocessingml/2006/main" xmlns:w14="http://schemas.microsoft.com/office/word/2010/wordml" xmlns:w15="http://schemas.microsoft.com/office/word/2012/wordml" xmlns:w16cex="http://schemas.microsoft.com/office/word/2018/wordml/cex" xmlns:w16cid="http://schemas.microsoft.com/office/word/2016/wordml/cid" xmlns:w16="http://schemas.microsoft.com/office/word/2018/wordml" xmlns:w16sdtdh="http://schemas.microsoft.com/office/word/2020/wordml/sdtdatahash" xmlns:w16se="http://schemas.microsoft.com/office/word/2015/wordml/symex" mc:Ignorable="w14 w15 w16se w16cid w16 w16cex w16sdtdh">
+<w:styles xmlns:mc="http://schemas.openxmlformats.org/markup-compatibility/2006" xmlns:r="http://schemas.openxmlformats.org/officeDocument/2006/relationships" xmlns:w="http://schemas.openxmlformats.org/wordprocessingml/2006/main" xmlns:w14="http://schemas.microsoft.com/office/word/2010/wordml" xmlns:w15="http://schemas.microsoft.com/office/word/2012/wordml" xmlns:w16cex="http://schemas.microsoft.com/office/word/2018/wordml/cex" xmlns:w16cid="http://schemas.microsoft.com/office/word/2016/wordml/cid" xmlns:w16="http://schemas.microsoft.com/office/word/2018/wordml" xmlns:w16du="http://schemas.microsoft.com/office/word/2023/wordml/word16du" xmlns:w16sdtdh="http://schemas.microsoft.com/office/word/2020/wordml/sdtdatahash" xmlns:w16sdtfl="http://schemas.microsoft.com/office/word/2024/wordml/sdtformatlock" xmlns:w16se="http://schemas.microsoft.com/office/word/2015/wordml/symex" mc:Ignorable="w14 w15 w16se w16cid w16 w16cex w16sdtdh w16sdtfl w16du">
   <w:docDefaults>
     <w:rPrDefault>
       <w:rPr>
@@ -15347,7 +16043,6 @@
   <w:style w:type="character" w:default="1" w:styleId="DefaultParagraphFont">
     <w:name w:val="Default Paragraph Font"/>
     <w:uiPriority w:val="1"/>
-    <w:semiHidden/>
     <w:unhideWhenUsed/>
   </w:style>
   <w:style w:type="table" w:default="1" w:styleId="TableNormal">

</xml_diff>